<commit_message>
se agrego el diseño para una columna
</commit_message>
<xml_diff>
--- a/src/assets/PlantillaUno.docx
+++ b/src/assets/PlantillaUno.docx
@@ -1,6 +1,6 @@
 
 <file path=word/document.xml><?xml version="1.0" encoding="utf-8"?>
-<w:document xmlns:wpc="http://schemas.microsoft.com/office/word/2010/wordprocessingCanvas" xmlns:cx="http://schemas.microsoft.com/office/drawing/2014/chartex" xmlns:cx1="http://schemas.microsoft.com/office/drawing/2015/9/8/chartex" xmlns:cx2="http://schemas.microsoft.com/office/drawing/2015/10/21/chartex" xmlns:cx3="http://schemas.microsoft.com/office/drawing/2016/5/9/chartex" xmlns:cx4="http://schemas.microsoft.com/office/drawing/2016/5/10/chartex" xmlns:cx5="http://schemas.microsoft.com/office/drawing/2016/5/11/chartex" xmlns:cx6="http://schemas.microsoft.com/office/drawing/2016/5/12/chartex" xmlns:cx7="http://schemas.microsoft.com/office/drawing/2016/5/13/chartex" xmlns:cx8="http://schemas.microsoft.com/office/drawing/2016/5/14/chartex" xmlns:mc="http://schemas.openxmlformats.org/markup-compatibility/2006" xmlns:aink="http://schemas.microsoft.com/office/drawing/2016/ink" xmlns:am3d="http://schemas.microsoft.com/office/drawing/2017/model3d" xmlns:o="urn:schemas-microsoft-com:office:office" xmlns:oel="http://schemas.microsoft.com/office/2019/extlst" xmlns:r="http://schemas.openxmlformats.org/officeDocument/2006/relationships" xmlns:m="http://schemas.openxmlformats.org/officeDocument/2006/math" xmlns:v="urn:schemas-microsoft-com:vml" xmlns:wp14="http://schemas.microsoft.com/office/word/2010/wordprocessingDrawing" xmlns:wp="http://schemas.openxmlformats.org/drawingml/2006/wordprocessingDrawing" xmlns:w10="urn:schemas-microsoft-com:office:word" xmlns:w="http://schemas.openxmlformats.org/wordprocessingml/2006/main" xmlns:w14="http://schemas.microsoft.com/office/word/2010/wordml" xmlns:w15="http://schemas.microsoft.com/office/word/2012/wordml" xmlns:w16cex="http://schemas.microsoft.com/office/word/2018/wordml/cex" xmlns:w16cid="http://schemas.microsoft.com/office/word/2016/wordml/cid" xmlns:w16="http://schemas.microsoft.com/office/word/2018/wordml" xmlns:w16sdtdh="http://schemas.microsoft.com/office/word/2020/wordml/sdtdatahash" xmlns:w16se="http://schemas.microsoft.com/office/word/2015/wordml/symex" xmlns:wpg="http://schemas.microsoft.com/office/word/2010/wordprocessingGroup" xmlns:wpi="http://schemas.microsoft.com/office/word/2010/wordprocessingInk" xmlns:wne="http://schemas.microsoft.com/office/word/2006/wordml" xmlns:wps="http://schemas.microsoft.com/office/word/2010/wordprocessingShape" mc:Ignorable="w14 w15 w16se w16cid w16 w16cex w16sdtdh wp14">
+<w:document xmlns:wpc="http://schemas.microsoft.com/office/word/2010/wordprocessingCanvas" xmlns:cx="http://schemas.microsoft.com/office/drawing/2014/chartex" xmlns:cx1="http://schemas.microsoft.com/office/drawing/2015/9/8/chartex" xmlns:mc="http://schemas.openxmlformats.org/markup-compatibility/2006" xmlns:o="urn:schemas-microsoft-com:office:office" xmlns:r="http://schemas.openxmlformats.org/officeDocument/2006/relationships" xmlns:m="http://schemas.openxmlformats.org/officeDocument/2006/math" xmlns:v="urn:schemas-microsoft-com:vml" xmlns:wp14="http://schemas.microsoft.com/office/word/2010/wordprocessingDrawing" xmlns:wp="http://schemas.openxmlformats.org/drawingml/2006/wordprocessingDrawing" xmlns:w10="urn:schemas-microsoft-com:office:word" xmlns:w="http://schemas.openxmlformats.org/wordprocessingml/2006/main" xmlns:w14="http://schemas.microsoft.com/office/word/2010/wordml" xmlns:w15="http://schemas.microsoft.com/office/word/2012/wordml" xmlns:w16se="http://schemas.microsoft.com/office/word/2015/wordml/symex" xmlns:wpg="http://schemas.microsoft.com/office/word/2010/wordprocessingGroup" xmlns:wpi="http://schemas.microsoft.com/office/word/2010/wordprocessingInk" xmlns:wne="http://schemas.microsoft.com/office/word/2006/wordml" xmlns:wps="http://schemas.microsoft.com/office/word/2010/wordprocessingShape" mc:Ignorable="w14 w15 w16se wp14">
   <w:body>
     <w:p>
       <w:pPr>
@@ -14,7 +14,7 @@
         <w:rPr>
           <w:noProof/>
           <w:color w:val="45B0E1" w:themeColor="accent1" w:themeTint="99"/>
-          <w:lang w:val="es-ES"/>
+          <w:lang w:eastAsia="es-MX"/>
         </w:rPr>
         <w:drawing>
           <wp:anchor distT="0" distB="0" distL="0" distR="0" simplePos="0" relativeHeight="251655168" behindDoc="0" locked="0" layoutInCell="1" allowOverlap="1" wp14:anchorId="673E7CBE" wp14:editId="7F2F11E4">
@@ -76,21 +76,12 @@
           </wp:anchor>
         </w:drawing>
       </w:r>
-      <w:proofErr w:type="spellStart"/>
       <w:r>
         <w:rPr>
           <w:color w:val="45B0E1" w:themeColor="accent1" w:themeTint="99"/>
           <w:lang w:val="es-ES"/>
         </w:rPr>
-        <w:t>Curriculum</w:t>
-      </w:r>
-      <w:proofErr w:type="spellEnd"/>
-      <w:r>
-        <w:rPr>
-          <w:color w:val="45B0E1" w:themeColor="accent1" w:themeTint="99"/>
-          <w:lang w:val="es-ES"/>
-        </w:rPr>
-        <w:t xml:space="preserve"> Vitae</w:t>
+        <w:t>Curriculum Vitae</w:t>
       </w:r>
     </w:p>
     <w:p>
@@ -107,42 +98,40 @@
           <w:lang w:val="es-ES"/>
         </w:rPr>
       </w:pPr>
-      <w:proofErr w:type="spellStart"/>
-      <w:r>
-        <w:rPr>
-          <w:lang w:val="es-ES"/>
-        </w:rPr>
-        <w:t>Curriculum</w:t>
-      </w:r>
-      <w:proofErr w:type="spellEnd"/>
-      <w:r>
-        <w:rPr>
-          <w:lang w:val="es-ES"/>
-        </w:rPr>
-        <w:t xml:space="preserve"> Vitae</w:t>
-      </w:r>
-    </w:p>
-    <w:p>
-      <w:pPr>
-        <w:rPr>
-          <w:lang w:val="es-ES"/>
-        </w:rPr>
-      </w:pPr>
-    </w:p>
-    <w:p>
-      <w:pPr>
-        <w:spacing w:after="0"/>
-        <w:rPr>
+      <w:r>
+        <w:rPr>
+          <w:lang w:val="es-ES"/>
+        </w:rPr>
+        <w:t>Curriculum Vitae</w:t>
+      </w:r>
+    </w:p>
+    <w:p>
+      <w:pPr>
+        <w:rPr>
+          <w:lang w:val="es-ES"/>
+        </w:rPr>
+      </w:pPr>
+    </w:p>
+    <w:p>
+      <w:pPr>
+        <w:spacing w:after="0"/>
+        <w:rPr>
+          <w:rFonts w:ascii="Palatino Linotype" w:hAnsi="Palatino Linotype"/>
           <w:b/>
           <w:bCs/>
+          <w:i/>
+          <w:iCs/>
           <w:color w:val="0070C0"/>
           <w:lang w:val="es-ES"/>
         </w:rPr>
       </w:pPr>
       <w:r>
         <w:rPr>
+          <w:rFonts w:ascii="Palatino Linotype" w:hAnsi="Palatino Linotype"/>
           <w:b/>
           <w:bCs/>
+          <w:i/>
+          <w:iCs/>
           <w:color w:val="0070C0"/>
           <w:lang w:val="es-ES"/>
         </w:rPr>
@@ -167,593 +156,642 @@
         </w:rPr>
         <w:t>‾‾‾‾‾‾‾‾‾‾‾‾‾‾‾‾‾‾‾‾‾‾‾‾‾‾‾‾‾‾‾‾‾‾‾‾‾‾‾‾‾‾‾‾‾‾‾‾‾‾‾‾‾‾‾‾‾‾‾‾‾‾‾‾‾‾‾‾‾‾‾‾‾‾‾‾‾‾‾‾‾‾‾‾‾‾‾‾‾‾‾‾‾‾‾‾‾</w:t>
       </w:r>
-    </w:p>
-    <w:p>
-      <w:pPr>
-        <w:spacing w:after="0"/>
-        <w:jc w:val="both"/>
-        <w:rPr>
-          <w:b/>
-          <w:bCs/>
-          <w:lang w:val="es-ES"/>
-        </w:rPr>
-      </w:pPr>
-      <w:r>
-        <w:t>Apellido y nombre:</w:t>
-      </w:r>
-      <w:r>
-        <w:t xml:space="preserve"> </w:t>
-      </w:r>
-      <w:r>
-        <w:rPr>
-          <w:b/>
-          <w:bCs/>
-          <w:lang w:val="es-ES"/>
-        </w:rPr>
-        <w:t>{</w:t>
-      </w:r>
-      <w:proofErr w:type="spellStart"/>
-      <w:r>
-        <w:rPr>
-          <w:b/>
-          <w:bCs/>
-          <w:lang w:val="es-ES"/>
-        </w:rPr>
-        <w:t>E</w:t>
-      </w:r>
-      <w:r>
-        <w:rPr>
-          <w:b/>
-          <w:bCs/>
-          <w:lang w:val="es-ES"/>
-        </w:rPr>
-        <w:t>tNom</w:t>
-      </w:r>
-      <w:proofErr w:type="spellEnd"/>
-      <w:r>
-        <w:rPr>
-          <w:b/>
-          <w:bCs/>
-          <w:lang w:val="es-ES"/>
-        </w:rPr>
-        <w:t>}</w:t>
-      </w:r>
-    </w:p>
-    <w:p>
-      <w:pPr>
-        <w:spacing w:after="0"/>
-        <w:jc w:val="both"/>
-        <w:rPr>
-          <w:b/>
-          <w:bCs/>
-        </w:rPr>
-      </w:pPr>
-      <w:r>
-        <w:rPr>
-          <w:lang w:val="es-ES"/>
-        </w:rPr>
-        <w:t>Años de experiencia profesional:</w:t>
-      </w:r>
-      <w:r>
-        <w:rPr>
-          <w:b/>
-          <w:bCs/>
-          <w:lang w:val="es-ES"/>
-        </w:rPr>
-        <w:t xml:space="preserve"> {</w:t>
-      </w:r>
-      <w:proofErr w:type="spellStart"/>
-      <w:r>
-        <w:rPr>
-          <w:b/>
-          <w:bCs/>
-        </w:rPr>
-        <w:t>EtTiempoExp</w:t>
-      </w:r>
-      <w:proofErr w:type="spellEnd"/>
-      <w:r>
-        <w:rPr>
-          <w:b/>
-          <w:bCs/>
-          <w:lang w:val="es-ES"/>
-        </w:rPr>
-        <w:t>}</w:t>
-      </w:r>
-    </w:p>
-    <w:p>
-      <w:pPr>
-        <w:spacing w:after="0"/>
-        <w:jc w:val="both"/>
-        <w:rPr>
-          <w:b/>
-          <w:bCs/>
-          <w:lang w:val="es-ES"/>
-        </w:rPr>
-      </w:pPr>
-      <w:r>
-        <w:t>Nacionalidad:</w:t>
-      </w:r>
-      <w:r>
-        <w:rPr>
-          <w:lang w:val="es-ES"/>
-        </w:rPr>
-        <w:t xml:space="preserve"> </w:t>
-      </w:r>
-      <w:r>
-        <w:rPr>
-          <w:b/>
-          <w:bCs/>
-          <w:lang w:val="es-ES"/>
-        </w:rPr>
-        <w:t>{</w:t>
-      </w:r>
-      <w:proofErr w:type="spellStart"/>
-      <w:r>
-        <w:rPr>
-          <w:b/>
-          <w:bCs/>
-          <w:lang w:val="es-ES"/>
-        </w:rPr>
-        <w:t>EtNa</w:t>
-      </w:r>
-      <w:proofErr w:type="spellEnd"/>
-      <w:r>
-        <w:rPr>
-          <w:b/>
-          <w:bCs/>
-          <w:lang w:val="es-ES"/>
-        </w:rPr>
-        <w:t>}</w:t>
-      </w:r>
-    </w:p>
-    <w:p>
-      <w:pPr>
-        <w:spacing w:after="0"/>
-        <w:jc w:val="both"/>
-        <w:rPr>
-          <w:b/>
-          <w:bCs/>
-          <w:lang w:val="es-ES"/>
-        </w:rPr>
-      </w:pPr>
-      <w:r>
-        <w:rPr>
-          <w:lang w:val="es-ES"/>
-        </w:rPr>
-        <w:t>Idiomas:</w:t>
-      </w:r>
-      <w:r>
-        <w:rPr>
-          <w:lang w:val="es-ES"/>
-        </w:rPr>
-        <w:t xml:space="preserve"> </w:t>
-      </w:r>
-      <w:r>
-        <w:rPr>
-          <w:b/>
-          <w:bCs/>
-          <w:lang w:val="es-ES"/>
-        </w:rPr>
-        <w:t>{</w:t>
-      </w:r>
-      <w:r>
-        <w:rPr>
-          <w:b/>
-          <w:bCs/>
-          <w:lang w:val="es-ES"/>
-        </w:rPr>
-        <w:t>#</w:t>
-      </w:r>
-      <w:r>
-        <w:rPr>
-          <w:b/>
-          <w:bCs/>
-          <w:lang w:val="es-ES"/>
-        </w:rPr>
-        <w:t>EtId</w:t>
-      </w:r>
-      <w:r>
-        <w:rPr>
-          <w:b/>
-          <w:bCs/>
-          <w:lang w:val="es-ES"/>
-        </w:rPr>
-        <w:t>}</w:t>
-      </w:r>
-      <w:r>
-        <w:rPr>
-          <w:b/>
-          <w:bCs/>
-          <w:lang w:val="es-ES"/>
-        </w:rPr>
-        <w:t xml:space="preserve"> </w:t>
-      </w:r>
-      <w:r>
-        <w:rPr>
-          <w:b/>
-          <w:bCs/>
-          <w:lang w:val="es-ES"/>
-        </w:rPr>
-        <w:t>{idioma} {/</w:t>
-      </w:r>
-      <w:proofErr w:type="spellStart"/>
-      <w:r>
-        <w:rPr>
-          <w:b/>
-          <w:bCs/>
-          <w:lang w:val="es-ES"/>
-        </w:rPr>
-        <w:t>EtId</w:t>
-      </w:r>
-      <w:proofErr w:type="spellEnd"/>
-      <w:r>
-        <w:rPr>
-          <w:b/>
-          <w:bCs/>
-          <w:lang w:val="es-ES"/>
-        </w:rPr>
-        <w:t>}</w:t>
-      </w:r>
-    </w:p>
-    <w:p>
-      <w:pPr>
-        <w:spacing w:after="0"/>
-        <w:jc w:val="both"/>
-        <w:rPr>
-          <w:b/>
-          <w:bCs/>
-          <w:lang w:val="es-ES"/>
-        </w:rPr>
-      </w:pPr>
-      <w:r>
-        <w:t>Residencia actual</w:t>
-      </w:r>
-      <w:r>
-        <w:t xml:space="preserve">: </w:t>
-      </w:r>
-      <w:r>
-        <w:rPr>
-          <w:b/>
-          <w:bCs/>
-          <w:lang w:val="es-ES"/>
-        </w:rPr>
-        <w:t>{</w:t>
-      </w:r>
-      <w:proofErr w:type="spellStart"/>
-      <w:r>
-        <w:rPr>
-          <w:b/>
-          <w:bCs/>
-          <w:lang w:val="es-ES"/>
-        </w:rPr>
-        <w:t>EtRe</w:t>
-      </w:r>
-      <w:proofErr w:type="spellEnd"/>
-      <w:r>
-        <w:rPr>
-          <w:b/>
-          <w:bCs/>
-          <w:lang w:val="es-ES"/>
-        </w:rPr>
-        <w:t>}</w:t>
-      </w:r>
-    </w:p>
-    <w:p>
-      <w:pPr>
-        <w:jc w:val="both"/>
-        <w:rPr>
-          <w:lang w:val="es-ES"/>
-        </w:rPr>
-      </w:pPr>
-      <w:r>
-        <w:t>Edad:</w:t>
-      </w:r>
-      <w:r>
-        <w:t xml:space="preserve"> </w:t>
-      </w:r>
-      <w:r>
-        <w:rPr>
-          <w:b/>
-          <w:bCs/>
-          <w:lang w:val="es-ES"/>
-        </w:rPr>
-        <w:t>{</w:t>
-      </w:r>
-      <w:proofErr w:type="spellStart"/>
-      <w:r>
-        <w:rPr>
-          <w:b/>
-          <w:bCs/>
-          <w:u w:val="single"/>
-          <w:lang w:val="es-ES"/>
-        </w:rPr>
-        <w:t>EtEd</w:t>
-      </w:r>
-      <w:proofErr w:type="spellEnd"/>
-      <w:r>
-        <w:rPr>
-          <w:b/>
-          <w:bCs/>
-          <w:lang w:val="es-ES"/>
-        </w:rPr>
-        <w:t>}</w:t>
-      </w:r>
-    </w:p>
-    <w:p>
-      <w:pPr>
-        <w:spacing w:after="0"/>
-        <w:rPr>
-          <w:b/>
-          <w:bCs/>
-          <w:color w:val="0070C0"/>
-          <w:lang w:val="es-ES"/>
-        </w:rPr>
-      </w:pPr>
-      <w:r>
-        <w:rPr>
-          <w:b/>
-          <w:bCs/>
-          <w:color w:val="0070C0"/>
-          <w:lang w:val="es-ES"/>
-        </w:rPr>
-        <w:t>ESTUDIOS CURSADOS</w:t>
-      </w:r>
-    </w:p>
-    <w:p>
-      <w:pPr>
-        <w:spacing w:after="0"/>
+      <w:r>
         <w:rPr>
           <w:b/>
           <w:bCs/>
           <w:color w:val="000000" w:themeColor="text1"/>
-          <w:lang w:val="es-ES"/>
-        </w:rPr>
-      </w:pPr>
-      <w:r>
+        </w:rPr>
+        <w:t>‾‾‾‾‾‾‾‾‾‾‾‾‾‾‾‾‾‾‾‾‾‾‾‾‾‾‾‾‾‾‾‾</w:t>
+      </w:r>
+    </w:p>
+    <w:p>
+      <w:pPr>
+        <w:spacing w:after="0"/>
+        <w:jc w:val="both"/>
+        <w:rPr>
+          <w:b/>
+          <w:bCs/>
+          <w:lang w:val="es-ES"/>
+        </w:rPr>
+      </w:pPr>
+      <w:r>
+        <w:rPr>
+          <w:rFonts w:ascii="Palatino Linotype" w:hAnsi="Palatino Linotype" w:cs="Calibri"/>
+          <w:b/>
+          <w:bCs/>
+          <w:sz w:val="28"/>
+          <w:szCs w:val="28"/>
+        </w:rPr>
+        <w:t>{</w:t>
+      </w:r>
+      <w:r>
+        <w:rPr>
+          <w:rFonts w:ascii="Palatino Linotype" w:hAnsi="Palatino Linotype" w:cs="Calibri"/>
+          <w:b/>
+          <w:bCs/>
+          <w:sz w:val="28"/>
+          <w:szCs w:val="28"/>
+        </w:rPr>
+        <w:t>E</w:t>
+      </w:r>
+      <w:r>
+        <w:rPr>
+          <w:rFonts w:ascii="Palatino Linotype" w:hAnsi="Palatino Linotype" w:cs="Calibri"/>
+          <w:b/>
+          <w:bCs/>
+          <w:sz w:val="28"/>
+          <w:szCs w:val="28"/>
+        </w:rPr>
+        <w:t>tNom</w:t>
+      </w:r>
+      <w:r>
+        <w:rPr>
+          <w:rFonts w:ascii="Palatino Linotype" w:hAnsi="Palatino Linotype" w:cs="Calibri"/>
+          <w:b/>
+          <w:bCs/>
+          <w:sz w:val="28"/>
+          <w:szCs w:val="28"/>
+        </w:rPr>
+        <w:t>}</w:t>
+      </w:r>
+    </w:p>
+    <w:p>
+      <w:pPr>
+        <w:spacing w:after="0"/>
+        <w:jc w:val="both"/>
+        <w:rPr>
+          <w:b/>
+          <w:bCs/>
+        </w:rPr>
+      </w:pPr>
+      <w:r>
+        <w:rPr>
+          <w:rFonts w:ascii="Palatino Linotype" w:hAnsi="Palatino Linotype" w:cs="Calibri"/>
+          <w:sz w:val="22"/>
+          <w:szCs w:val="22"/>
+          <w:lang w:val="es-ES"/>
+        </w:rPr>
+        <w:t>Años de experiencia</w:t>
+      </w:r>
+      <w:r>
+        <w:rPr>
+          <w:lang w:val="es-ES"/>
+        </w:rPr>
+        <w:t xml:space="preserve"> </w:t>
+      </w:r>
+      <w:r>
+        <w:rPr>
+          <w:rFonts w:ascii="Palatino Linotype" w:hAnsi="Palatino Linotype" w:cs="Calibri"/>
+          <w:sz w:val="22"/>
+          <w:szCs w:val="22"/>
+          <w:lang w:val="es-ES"/>
+        </w:rPr>
+        <w:t>profesional</w:t>
+      </w:r>
+      <w:r>
+        <w:rPr>
+          <w:lang w:val="es-ES"/>
+        </w:rPr>
+        <w:t>:</w:t>
+      </w:r>
+      <w:r>
+        <w:rPr>
+          <w:rFonts w:ascii="Palatino Linotype" w:hAnsi="Palatino Linotype" w:cs="Calibri"/>
+          <w:b/>
+          <w:sz w:val="22"/>
+          <w:szCs w:val="22"/>
+          <w:lang w:val="es-ES"/>
+        </w:rPr>
+        <w:t xml:space="preserve"> {EtTiempoExp}</w:t>
+      </w:r>
+    </w:p>
+    <w:p>
+      <w:pPr>
+        <w:spacing w:after="0"/>
+        <w:jc w:val="both"/>
+        <w:rPr>
+          <w:rFonts w:ascii="Palatino Linotype" w:hAnsi="Palatino Linotype" w:cs="Calibri"/>
+          <w:sz w:val="22"/>
+          <w:szCs w:val="22"/>
+          <w:lang w:val="es-ES"/>
+        </w:rPr>
+      </w:pPr>
+      <w:r>
+        <w:rPr>
+          <w:rFonts w:ascii="Palatino Linotype" w:hAnsi="Palatino Linotype" w:cs="Calibri"/>
+          <w:sz w:val="22"/>
+          <w:szCs w:val="22"/>
+          <w:lang w:val="es-ES"/>
+        </w:rPr>
+        <w:t>{</w:t>
+      </w:r>
+      <w:r>
+        <w:rPr>
+          <w:rFonts w:ascii="Palatino Linotype" w:hAnsi="Palatino Linotype" w:cs="Calibri"/>
+          <w:sz w:val="22"/>
+          <w:szCs w:val="22"/>
+          <w:lang w:val="es-ES"/>
+        </w:rPr>
+        <w:t>#</w:t>
+      </w:r>
+      <w:r>
+        <w:rPr>
+          <w:rFonts w:ascii="Palatino Linotype" w:hAnsi="Palatino Linotype" w:cs="Calibri"/>
+          <w:sz w:val="22"/>
+          <w:szCs w:val="22"/>
+          <w:lang w:val="es-ES"/>
+        </w:rPr>
+        <w:t>EtId</w:t>
+      </w:r>
+      <w:r>
+        <w:rPr>
+          <w:rFonts w:ascii="Palatino Linotype" w:hAnsi="Palatino Linotype" w:cs="Calibri"/>
+          <w:sz w:val="22"/>
+          <w:szCs w:val="22"/>
+          <w:lang w:val="es-ES"/>
+        </w:rPr>
+        <w:t>}</w:t>
+      </w:r>
+      <w:r>
+        <w:rPr>
+          <w:rFonts w:ascii="Palatino Linotype" w:hAnsi="Palatino Linotype" w:cs="Calibri"/>
+          <w:sz w:val="22"/>
+          <w:szCs w:val="22"/>
+          <w:lang w:val="es-ES"/>
+        </w:rPr>
+        <w:t xml:space="preserve"> </w:t>
+      </w:r>
+      <w:r>
+        <w:rPr>
+          <w:rFonts w:ascii="Palatino Linotype" w:hAnsi="Palatino Linotype" w:cs="Calibri"/>
+          <w:sz w:val="22"/>
+          <w:szCs w:val="22"/>
+          <w:lang w:val="es-ES"/>
+        </w:rPr>
+        <w:t>{idioma}</w:t>
+      </w:r>
+      <w:r>
+        <w:rPr>
+          <w:rFonts w:ascii="Palatino Linotype" w:hAnsi="Palatino Linotype" w:cs="Calibri"/>
+          <w:sz w:val="22"/>
+          <w:szCs w:val="22"/>
+          <w:lang w:val="es-ES"/>
+        </w:rPr>
+        <w:t>.</w:t>
+      </w:r>
+      <w:r>
+        <w:rPr>
+          <w:rFonts w:ascii="Palatino Linotype" w:hAnsi="Palatino Linotype" w:cs="Calibri"/>
+          <w:sz w:val="22"/>
+          <w:szCs w:val="22"/>
+          <w:lang w:val="es-ES"/>
+        </w:rPr>
+        <w:t xml:space="preserve"> {/EtId}</w:t>
+      </w:r>
+    </w:p>
+    <w:p>
+      <w:pPr>
+        <w:spacing w:after="0"/>
+        <w:jc w:val="both"/>
+        <w:rPr>
+          <w:rFonts w:ascii="Palatino Linotype" w:hAnsi="Palatino Linotype" w:cs="Calibri"/>
+          <w:sz w:val="22"/>
+          <w:szCs w:val="22"/>
+          <w:lang w:val="es-ES"/>
+        </w:rPr>
+      </w:pPr>
+      <w:r>
+        <w:rPr>
+          <w:rFonts w:ascii="Palatino Linotype" w:hAnsi="Palatino Linotype" w:cs="Calibri"/>
+          <w:sz w:val="22"/>
+          <w:szCs w:val="22"/>
+          <w:lang w:val="es-ES"/>
+        </w:rPr>
+        <w:t>{EtEd}</w:t>
+      </w:r>
+      <w:r>
+        <w:rPr>
+          <w:rFonts w:ascii="Palatino Linotype" w:hAnsi="Palatino Linotype" w:cs="Calibri"/>
+          <w:sz w:val="22"/>
+          <w:szCs w:val="22"/>
+          <w:lang w:val="es-ES"/>
+        </w:rPr>
+        <w:t xml:space="preserve"> A</w:t>
+      </w:r>
+      <w:r>
+        <w:rPr>
+          <w:rFonts w:ascii="Palatino Linotype" w:hAnsi="Palatino Linotype" w:cs="Calibri"/>
+          <w:sz w:val="22"/>
+          <w:szCs w:val="22"/>
+          <w:lang w:val="es-ES"/>
+        </w:rPr>
+        <w:t>ños</w:t>
+      </w:r>
+      <w:r>
+        <w:rPr>
+          <w:rFonts w:ascii="Palatino Linotype" w:hAnsi="Palatino Linotype" w:cs="Calibri"/>
+          <w:sz w:val="22"/>
+          <w:szCs w:val="22"/>
+          <w:lang w:val="es-ES"/>
+        </w:rPr>
+        <w:t xml:space="preserve">, </w:t>
+      </w:r>
+      <w:r>
+        <w:rPr>
+          <w:rFonts w:ascii="Palatino Linotype" w:hAnsi="Palatino Linotype" w:cs="Calibri"/>
+          <w:sz w:val="22"/>
+          <w:szCs w:val="22"/>
+          <w:lang w:val="es-ES"/>
+        </w:rPr>
+        <w:t>{</w:t>
+      </w:r>
+      <w:r>
+        <w:rPr>
+          <w:rFonts w:ascii="Palatino Linotype" w:hAnsi="Palatino Linotype" w:cs="Calibri"/>
+          <w:sz w:val="22"/>
+          <w:szCs w:val="22"/>
+          <w:lang w:val="es-ES"/>
+        </w:rPr>
+        <w:t>EtRe</w:t>
+      </w:r>
+      <w:r>
+        <w:rPr>
+          <w:rFonts w:ascii="Palatino Linotype" w:hAnsi="Palatino Linotype" w:cs="Calibri"/>
+          <w:sz w:val="22"/>
+          <w:szCs w:val="22"/>
+          <w:lang w:val="es-ES"/>
+        </w:rPr>
+        <w:t>}</w:t>
+      </w:r>
+      <w:r>
+        <w:rPr>
+          <w:rFonts w:ascii="Palatino Linotype" w:hAnsi="Palatino Linotype" w:cs="Calibri"/>
+          <w:sz w:val="22"/>
+          <w:szCs w:val="22"/>
+          <w:lang w:val="es-ES"/>
+        </w:rPr>
+        <w:t>.</w:t>
+      </w:r>
+    </w:p>
+    <w:p>
+      <w:pPr>
+        <w:spacing w:after="0"/>
+        <w:jc w:val="both"/>
+        <w:rPr>
+          <w:b/>
+          <w:bCs/>
+          <w:lang w:val="es-ES"/>
+        </w:rPr>
+      </w:pPr>
+    </w:p>
+    <w:p>
+      <w:pPr>
+        <w:spacing w:after="0"/>
+        <w:jc w:val="both"/>
+        <w:rPr>
+          <w:rFonts w:ascii="Palatino Linotype" w:hAnsi="Palatino Linotype" w:cs="Calibri"/>
+          <w:sz w:val="22"/>
+          <w:szCs w:val="22"/>
+          <w:lang w:val="es-ES"/>
+        </w:rPr>
+      </w:pPr>
+      <w:r>
+        <w:rPr>
+          <w:rFonts w:ascii="Palatino Linotype" w:hAnsi="Palatino Linotype" w:cs="Calibri"/>
+          <w:sz w:val="22"/>
+          <w:szCs w:val="22"/>
+          <w:lang w:val="es-ES"/>
+        </w:rPr>
+        <w:t>{#tieneComentarios}</w:t>
+      </w:r>
+    </w:p>
+    <w:p>
+      <w:pPr>
+        <w:spacing w:after="0"/>
+        <w:jc w:val="both"/>
+        <w:rPr>
+          <w:rFonts w:ascii="Palatino Linotype" w:hAnsi="Palatino Linotype" w:cs="Calibri"/>
+          <w:sz w:val="22"/>
+          <w:szCs w:val="22"/>
+          <w:lang w:val="es-ES"/>
+        </w:rPr>
+      </w:pPr>
+      <w:r>
+        <w:rPr>
+          <w:rFonts w:ascii="Palatino Linotype" w:hAnsi="Palatino Linotype" w:cs="Calibri"/>
+          <w:sz w:val="22"/>
+          <w:szCs w:val="22"/>
+          <w:lang w:val="es-ES"/>
+        </w:rPr>
+        <w:t>{comentarios}</w:t>
+      </w:r>
+    </w:p>
+    <w:p>
+      <w:pPr>
+        <w:spacing w:after="0"/>
+        <w:jc w:val="both"/>
+        <w:rPr>
+          <w:rFonts w:ascii="Palatino Linotype" w:hAnsi="Palatino Linotype" w:cs="Calibri"/>
+          <w:sz w:val="22"/>
+          <w:szCs w:val="22"/>
+          <w:lang w:val="es-ES"/>
+        </w:rPr>
+      </w:pPr>
+      <w:r>
+        <w:rPr>
+          <w:rFonts w:ascii="Palatino Linotype" w:hAnsi="Palatino Linotype" w:cs="Calibri"/>
+          <w:sz w:val="22"/>
+          <w:szCs w:val="22"/>
+          <w:lang w:val="es-ES"/>
+        </w:rPr>
+        <w:t>{/tieneComentarios}</w:t>
+      </w:r>
+    </w:p>
+    <w:p>
+      <w:pPr>
+        <w:spacing w:after="0"/>
+      </w:pPr>
+    </w:p>
+    <w:p>
+      <w:pPr>
+        <w:spacing w:after="0"/>
+        <w:rPr>
+          <w:rFonts w:ascii="Palatino Linotype" w:hAnsi="Palatino Linotype"/>
+          <w:b/>
+          <w:bCs/>
+          <w:i/>
+          <w:iCs/>
+          <w:color w:val="0070C0"/>
+          <w:lang w:val="es-ES"/>
+        </w:rPr>
+      </w:pPr>
+      <w:r>
+        <w:rPr>
+          <w:rFonts w:ascii="Palatino Linotype" w:hAnsi="Palatino Linotype"/>
+          <w:b/>
+          <w:bCs/>
+          <w:i/>
+          <w:iCs/>
+          <w:color w:val="0070C0"/>
+          <w:lang w:val="es-ES"/>
+        </w:rPr>
+        <w:t>ESTUDIOS CURSADOS</w:t>
+      </w:r>
+    </w:p>
+    <w:p>
+      <w:pPr>
+        <w:spacing w:after="0"/>
         <w:rPr>
           <w:b/>
           <w:bCs/>
           <w:color w:val="000000" w:themeColor="text1"/>
-        </w:rPr>
-        <w:t>‾‾‾‾‾‾‾‾‾‾‾‾‾‾‾‾‾‾‾‾‾‾‾‾‾‾‾‾‾‾‾‾‾‾‾‾‾‾‾‾‾‾‾‾‾‾‾‾‾‾‾‾‾‾‾‾‾‾‾‾‾‾‾‾‾‾‾‾‾‾‾‾‾‾‾‾‾‾‾‾‾‾‾‾‾‾‾‾‾‾‾‾‾‾‾‾‾</w:t>
-      </w:r>
-    </w:p>
-    <w:p>
-      <w:pPr>
-        <w:spacing w:after="0"/>
-        <w:jc w:val="both"/>
-      </w:pPr>
-      <w:r>
-        <w:rPr>
-          <w:lang w:val="es-ES"/>
-        </w:rPr>
-        <w:t>{#</w:t>
-      </w:r>
-      <w:r>
-        <w:t>estudios</w:t>
-      </w:r>
-      <w:r>
-        <w:rPr>
-          <w:lang w:val="es-ES"/>
-        </w:rPr>
-        <w:t>}</w:t>
-      </w:r>
-    </w:p>
-    <w:p>
-      <w:pPr>
-        <w:spacing w:after="0"/>
-        <w:jc w:val="both"/>
-        <w:rPr>
-          <w:b/>
-          <w:bCs/>
-          <w:lang w:val="es-ES"/>
-        </w:rPr>
-      </w:pPr>
-      <w:r>
-        <w:rPr>
-          <w:b/>
-          <w:bCs/>
-          <w:lang w:val="es-ES"/>
-        </w:rPr>
-        <w:t>{universidad}</w:t>
-      </w:r>
-    </w:p>
-    <w:p>
-      <w:pPr>
-        <w:spacing w:after="0"/>
-        <w:jc w:val="both"/>
-        <w:rPr>
-          <w:b/>
-          <w:bCs/>
-          <w:lang w:val="es-ES"/>
-        </w:rPr>
-      </w:pPr>
-      <w:r>
-        <w:rPr>
-          <w:lang w:val="es-ES"/>
-        </w:rPr>
-        <w:t>Carrera:</w:t>
-      </w:r>
-      <w:r>
-        <w:rPr>
-          <w:b/>
-          <w:bCs/>
-          <w:lang w:val="es-ES"/>
-        </w:rPr>
-        <w:t xml:space="preserve"> {carrera}</w:t>
-      </w:r>
-    </w:p>
-    <w:p>
-      <w:pPr>
-        <w:spacing w:after="0"/>
-        <w:jc w:val="both"/>
-        <w:rPr>
-          <w:b/>
-          <w:bCs/>
-          <w:u w:val="single"/>
-          <w:lang w:val="es-ES"/>
-        </w:rPr>
-      </w:pPr>
-      <w:r>
-        <w:rPr>
-          <w:lang w:val="es-ES"/>
-        </w:rPr>
-        <w:t>Fecha de inicio:</w:t>
-      </w:r>
-      <w:r>
-        <w:rPr>
-          <w:b/>
-          <w:bCs/>
-          <w:lang w:val="es-ES"/>
-        </w:rPr>
-        <w:t xml:space="preserve"> {</w:t>
-      </w:r>
-      <w:proofErr w:type="spellStart"/>
-      <w:r>
-        <w:rPr>
-          <w:b/>
-          <w:bCs/>
-          <w:lang w:val="es-ES"/>
-        </w:rPr>
-        <w:t>fechaIni</w:t>
-      </w:r>
-      <w:proofErr w:type="spellEnd"/>
-      <w:r>
-        <w:rPr>
-          <w:b/>
-          <w:bCs/>
-          <w:lang w:val="es-ES"/>
-        </w:rPr>
-        <w:t>}</w:t>
-      </w:r>
-    </w:p>
-    <w:p>
-      <w:pPr>
-        <w:jc w:val="both"/>
-        <w:rPr>
-          <w:b/>
-          <w:bCs/>
-          <w:lang w:val="es-ES"/>
-        </w:rPr>
-      </w:pPr>
-      <w:r>
-        <w:t>Generación</w:t>
-      </w:r>
-      <w:r>
-        <w:rPr>
-          <w:lang w:val="es-ES"/>
-        </w:rPr>
-        <w:t>:</w:t>
-      </w:r>
-      <w:r>
-        <w:rPr>
-          <w:b/>
-          <w:bCs/>
-          <w:lang w:val="es-ES"/>
-        </w:rPr>
-        <w:t xml:space="preserve"> {</w:t>
-      </w:r>
-      <w:proofErr w:type="spellStart"/>
-      <w:r>
-        <w:rPr>
-          <w:b/>
-          <w:bCs/>
-          <w:lang w:val="es-ES"/>
-        </w:rPr>
-        <w:t>generacion</w:t>
-      </w:r>
-      <w:proofErr w:type="spellEnd"/>
-      <w:r>
-        <w:rPr>
-          <w:b/>
-          <w:bCs/>
-          <w:lang w:val="es-ES"/>
-        </w:rPr>
-        <w:t>}</w:t>
-      </w:r>
-    </w:p>
-    <w:p>
-      <w:pPr>
-        <w:spacing w:after="0"/>
-        <w:jc w:val="both"/>
-        <w:rPr>
-          <w:lang w:val="es-ES"/>
-        </w:rPr>
-      </w:pPr>
-      <w:r>
-        <w:rPr>
-          <w:lang w:val="es-ES"/>
-        </w:rPr>
-        <w:t>{/</w:t>
-      </w:r>
-      <w:r>
-        <w:t>estudios</w:t>
-      </w:r>
-      <w:r>
-        <w:rPr>
-          <w:lang w:val="es-ES"/>
-        </w:rPr>
-        <w:t>}</w:t>
-      </w:r>
-    </w:p>
-    <w:p>
-      <w:pPr>
-        <w:jc w:val="both"/>
-        <w:rPr>
-          <w:lang w:val="es-ES"/>
-        </w:rPr>
-      </w:pPr>
-      <w:r>
-        <w:rPr>
-          <w:lang w:val="es-ES"/>
-        </w:rPr>
-        <w:t>{#tieneConocimientos}</w:t>
-      </w:r>
-    </w:p>
-    <w:p>
-      <w:pPr>
-        <w:spacing w:after="0"/>
-        <w:rPr>
-          <w:b/>
-          <w:bCs/>
-          <w:color w:val="0070C0"/>
-          <w:lang w:val="es-ES"/>
-        </w:rPr>
-      </w:pPr>
-      <w:r>
-        <w:rPr>
-          <w:b/>
-          <w:bCs/>
-          <w:color w:val="0070C0"/>
-          <w:lang w:val="es-ES"/>
-        </w:rPr>
-        <w:t>CONOCIMIENTO TECNICO</w:t>
-      </w:r>
-    </w:p>
-    <w:p>
-      <w:pPr>
-        <w:spacing w:after="0"/>
+          <w:lang w:val="es-ES"/>
+        </w:rPr>
+      </w:pPr>
+      <w:r>
         <w:rPr>
           <w:b/>
           <w:bCs/>
           <w:color w:val="000000" w:themeColor="text1"/>
-          <w:lang w:val="es-ES"/>
-        </w:rPr>
-      </w:pPr>
+        </w:rPr>
+        <w:t>‾‾‾‾‾‾‾‾‾‾‾‾‾‾‾‾‾‾‾‾‾‾‾‾‾‾‾‾‾‾‾‾‾‾‾‾‾‾‾‾‾‾‾‾‾‾‾‾‾‾‾‾‾‾‾‾‾‾‾‾‾‾‾‾‾‾‾‾‾‾‾‾‾‾‾‾‾‾‾‾‾‾‾‾‾‾‾‾‾‾‾‾‾‾‾‾‾</w:t>
+      </w:r>
       <w:r>
         <w:rPr>
           <w:b/>
           <w:bCs/>
           <w:color w:val="000000" w:themeColor="text1"/>
         </w:rPr>
+        <w:t>‾‾‾‾‾‾‾‾‾‾‾‾‾‾‾‾‾‾‾‾‾‾‾‾‾‾‾‾‾‾‾‾</w:t>
+      </w:r>
+    </w:p>
+    <w:p>
+      <w:pPr>
+        <w:spacing w:after="0"/>
+        <w:jc w:val="both"/>
+        <w:rPr>
+          <w:rFonts w:ascii="Palatino Linotype" w:hAnsi="Palatino Linotype" w:cs="Calibri"/>
+          <w:sz w:val="22"/>
+          <w:szCs w:val="22"/>
+          <w:lang w:val="es-ES"/>
+        </w:rPr>
+      </w:pPr>
+      <w:r>
+        <w:rPr>
+          <w:rFonts w:ascii="Palatino Linotype" w:hAnsi="Palatino Linotype" w:cs="Calibri"/>
+          <w:sz w:val="22"/>
+          <w:szCs w:val="22"/>
+          <w:lang w:val="es-ES"/>
+        </w:rPr>
+        <w:t>{#</w:t>
+      </w:r>
+      <w:r>
+        <w:rPr>
+          <w:rFonts w:ascii="Palatino Linotype" w:hAnsi="Palatino Linotype" w:cs="Calibri"/>
+          <w:sz w:val="22"/>
+          <w:szCs w:val="22"/>
+          <w:lang w:val="es-ES"/>
+        </w:rPr>
+        <w:t>estudios</w:t>
+      </w:r>
+      <w:r>
+        <w:rPr>
+          <w:rFonts w:ascii="Palatino Linotype" w:hAnsi="Palatino Linotype" w:cs="Calibri"/>
+          <w:sz w:val="22"/>
+          <w:szCs w:val="22"/>
+          <w:lang w:val="es-ES"/>
+        </w:rPr>
+        <w:t>}</w:t>
+      </w:r>
+    </w:p>
+    <w:p>
+      <w:pPr>
+        <w:spacing w:after="0"/>
+        <w:jc w:val="both"/>
+        <w:rPr>
+          <w:rFonts w:ascii="Palatino Linotype" w:hAnsi="Palatino Linotype" w:cs="Calibri"/>
+          <w:b/>
+          <w:szCs w:val="22"/>
+          <w:lang w:val="es-ES"/>
+        </w:rPr>
+      </w:pPr>
+      <w:r>
+        <w:rPr>
+          <w:rFonts w:ascii="Palatino Linotype" w:hAnsi="Palatino Linotype" w:cs="Calibri"/>
+          <w:b/>
+          <w:szCs w:val="22"/>
+          <w:lang w:val="es-ES"/>
+        </w:rPr>
+        <w:t>{universidad}</w:t>
+      </w:r>
+    </w:p>
+    <w:p>
+      <w:pPr>
+        <w:spacing w:after="0"/>
+        <w:jc w:val="both"/>
+        <w:rPr>
+          <w:rFonts w:ascii="Palatino Linotype" w:hAnsi="Palatino Linotype" w:cs="Calibri"/>
+          <w:sz w:val="22"/>
+          <w:szCs w:val="22"/>
+          <w:lang w:val="es-ES"/>
+        </w:rPr>
+      </w:pPr>
+      <w:r>
+        <w:rPr>
+          <w:rFonts w:ascii="Palatino Linotype" w:hAnsi="Palatino Linotype" w:cs="Calibri"/>
+          <w:sz w:val="22"/>
+          <w:szCs w:val="22"/>
+          <w:lang w:val="es-ES"/>
+        </w:rPr>
+        <w:t>{carrera}</w:t>
+      </w:r>
+      <w:r>
+        <w:rPr>
+          <w:rFonts w:ascii="Palatino Linotype" w:hAnsi="Palatino Linotype" w:cs="Calibri"/>
+          <w:sz w:val="22"/>
+          <w:szCs w:val="22"/>
+          <w:lang w:val="es-ES"/>
+        </w:rPr>
+        <w:t>-{fechaIni}-</w:t>
+      </w:r>
+      <w:r>
+        <w:rPr>
+          <w:rFonts w:ascii="Palatino Linotype" w:hAnsi="Palatino Linotype" w:cs="Calibri"/>
+          <w:sz w:val="22"/>
+          <w:szCs w:val="22"/>
+          <w:lang w:val="es-ES"/>
+        </w:rPr>
+        <w:t>{generacion}</w:t>
+      </w:r>
+    </w:p>
+    <w:p>
+      <w:pPr>
+        <w:spacing w:after="0"/>
+        <w:jc w:val="both"/>
+        <w:rPr>
+          <w:rFonts w:ascii="Palatino Linotype" w:hAnsi="Palatino Linotype" w:cs="Calibri"/>
+          <w:sz w:val="22"/>
+          <w:szCs w:val="22"/>
+          <w:lang w:val="es-ES"/>
+        </w:rPr>
+      </w:pPr>
+      <w:r>
+        <w:rPr>
+          <w:rFonts w:ascii="Palatino Linotype" w:hAnsi="Palatino Linotype" w:cs="Calibri"/>
+          <w:sz w:val="22"/>
+          <w:szCs w:val="22"/>
+          <w:lang w:val="es-ES"/>
+        </w:rPr>
+        <w:t>{/</w:t>
+      </w:r>
+      <w:r>
+        <w:rPr>
+          <w:rFonts w:ascii="Palatino Linotype" w:hAnsi="Palatino Linotype" w:cs="Calibri"/>
+          <w:sz w:val="22"/>
+          <w:szCs w:val="22"/>
+          <w:lang w:val="es-ES"/>
+        </w:rPr>
+        <w:t>estudios</w:t>
+      </w:r>
+      <w:r>
+        <w:rPr>
+          <w:rFonts w:ascii="Palatino Linotype" w:hAnsi="Palatino Linotype" w:cs="Calibri"/>
+          <w:sz w:val="22"/>
+          <w:szCs w:val="22"/>
+          <w:lang w:val="es-ES"/>
+        </w:rPr>
+        <w:t>}</w:t>
+      </w:r>
+    </w:p>
+    <w:p>
+      <w:pPr>
+        <w:jc w:val="both"/>
+        <w:rPr>
+          <w:rFonts w:ascii="Palatino Linotype" w:hAnsi="Palatino Linotype" w:cs="Calibri"/>
+          <w:sz w:val="22"/>
+          <w:szCs w:val="22"/>
+          <w:lang w:val="es-ES"/>
+        </w:rPr>
+      </w:pPr>
+      <w:r>
+        <w:rPr>
+          <w:rFonts w:ascii="Palatino Linotype" w:hAnsi="Palatino Linotype" w:cs="Calibri"/>
+          <w:sz w:val="22"/>
+          <w:szCs w:val="22"/>
+          <w:lang w:val="es-ES"/>
+        </w:rPr>
+        <w:t>{#tieneConocimientos}</w:t>
+      </w:r>
+    </w:p>
+    <w:p>
+      <w:pPr>
+        <w:spacing w:after="0"/>
+        <w:rPr>
+          <w:rFonts w:ascii="Palatino Linotype" w:hAnsi="Palatino Linotype" w:cs="Calibri"/>
+          <w:sz w:val="22"/>
+          <w:szCs w:val="22"/>
+          <w:lang w:val="es-ES"/>
+        </w:rPr>
+      </w:pPr>
+    </w:p>
+    <w:p>
+      <w:pPr>
+        <w:spacing w:after="0"/>
+        <w:rPr>
+          <w:rFonts w:ascii="Palatino Linotype" w:hAnsi="Palatino Linotype"/>
+          <w:b/>
+          <w:bCs/>
+          <w:i/>
+          <w:iCs/>
+          <w:color w:val="0070C0"/>
+          <w:lang w:val="es-ES"/>
+        </w:rPr>
+      </w:pPr>
+      <w:r>
+        <w:rPr>
+          <w:rFonts w:ascii="Palatino Linotype" w:hAnsi="Palatino Linotype"/>
+          <w:b/>
+          <w:bCs/>
+          <w:i/>
+          <w:iCs/>
+          <w:color w:val="0070C0"/>
+          <w:lang w:val="es-ES"/>
+        </w:rPr>
+        <w:t>CONOCIMIENTO TECNICO</w:t>
+      </w:r>
+    </w:p>
+    <w:p>
+      <w:pPr>
+        <w:spacing w:after="0"/>
+        <w:rPr>
+          <w:b/>
+          <w:bCs/>
+          <w:color w:val="000000" w:themeColor="text1"/>
+          <w:lang w:val="es-ES"/>
+        </w:rPr>
+      </w:pPr>
+      <w:r>
+        <w:rPr>
+          <w:b/>
+          <w:bCs/>
+          <w:color w:val="000000" w:themeColor="text1"/>
+        </w:rPr>
         <w:t>‾‾‾‾‾‾‾‾‾‾‾‾‾‾‾‾‾‾‾‾‾‾‾‾‾‾‾‾‾‾‾‾‾‾‾‾‾‾‾‾‾‾‾‾‾‾‾‾‾‾‾‾‾‾‾‾‾‾‾‾‾‾‾‾‾‾‾‾‾‾‾‾‾‾‾‾‾‾‾‾‾‾‾‾‾‾‾‾‾‾‾‾‾‾‾‾‾</w:t>
+      </w:r>
+      <w:r>
+        <w:rPr>
+          <w:b/>
+          <w:bCs/>
+          <w:color w:val="000000" w:themeColor="text1"/>
+        </w:rPr>
+        <w:t>‾‾‾‾‾‾‾‾‾‾‾‾‾‾‾‾‾‾‾‾‾‾‾‾‾‾‾‾‾‾‾‾</w:t>
       </w:r>
     </w:p>
     <w:tbl>
       <w:tblPr>
         <w:tblStyle w:val="Tablaconcuadrcula"/>
         <w:tblW w:w="0" w:type="auto"/>
-        <w:jc w:val="center"/>
         <w:tblBorders>
           <w:top w:val="none" w:sz="0" w:space="0" w:color="auto"/>
           <w:left w:val="none" w:sz="0" w:space="0" w:color="auto"/>
@@ -773,7 +811,7 @@
       </w:tblGrid>
       <w:tr>
         <w:trPr>
-          <w:jc w:val="center"/>
+          <w:trHeight w:val="510"/>
         </w:trPr>
         <w:tc>
           <w:tcPr>
@@ -783,27 +821,46 @@
           <w:p>
             <w:pPr>
               <w:rPr>
+                <w:rFonts w:ascii="Palatino Linotype" w:hAnsi="Palatino Linotype" w:cs="Calibri"/>
+                <w:sz w:val="22"/>
+                <w:szCs w:val="22"/>
                 <w:lang w:val="es-ES"/>
               </w:rPr>
             </w:pPr>
             <w:r>
-              <w:t>{#</w:t>
-            </w:r>
-            <w:proofErr w:type="gramStart"/>
-            <w:r>
-              <w:t>conocimientos}</w:t>
+              <w:rPr>
+                <w:rFonts w:ascii="Palatino Linotype" w:hAnsi="Palatino Linotype" w:cs="Calibri"/>
+                <w:sz w:val="22"/>
+                <w:szCs w:val="22"/>
+                <w:lang w:val="es-ES"/>
+              </w:rPr>
+              <w:t>{#conocimientos}</w:t>
             </w:r>
             <w:r>
-              <w:t>{</w:t>
-            </w:r>
-            <w:proofErr w:type="gramEnd"/>
-            <w:r>
-              <w:t>#conocimiento1}</w:t>
+              <w:rPr>
+                <w:rFonts w:ascii="Palatino Linotype" w:hAnsi="Palatino Linotype" w:cs="Calibri"/>
+                <w:sz w:val="22"/>
+                <w:szCs w:val="22"/>
+                <w:lang w:val="es-ES"/>
+              </w:rPr>
+              <w:t>{#conocimiento1}</w:t>
             </w:r>
             <w:r>
+              <w:rPr>
+                <w:rFonts w:ascii="Palatino Linotype" w:hAnsi="Palatino Linotype" w:cs="Calibri"/>
+                <w:sz w:val="22"/>
+                <w:szCs w:val="22"/>
+                <w:lang w:val="es-ES"/>
+              </w:rPr>
               <w:t>•</w:t>
             </w:r>
             <w:r>
+              <w:rPr>
+                <w:rFonts w:ascii="Palatino Linotype" w:hAnsi="Palatino Linotype" w:cs="Calibri"/>
+                <w:sz w:val="22"/>
+                <w:szCs w:val="22"/>
+                <w:lang w:val="es-ES"/>
+              </w:rPr>
               <w:t>{conocimiento1}{/conocimiento1}</w:t>
             </w:r>
           </w:p>
@@ -816,30 +873,64 @@
           <w:p>
             <w:pPr>
               <w:rPr>
+                <w:rFonts w:ascii="Palatino Linotype" w:hAnsi="Palatino Linotype" w:cs="Calibri"/>
+                <w:sz w:val="22"/>
+                <w:szCs w:val="22"/>
                 <w:lang w:val="es-ES"/>
               </w:rPr>
             </w:pPr>
             <w:r>
-              <w:t>{#conocimiento</w:t>
-            </w:r>
-            <w:proofErr w:type="gramStart"/>
-            <w:r>
-              <w:t>2}</w:t>
+              <w:rPr>
+                <w:rFonts w:ascii="Palatino Linotype" w:hAnsi="Palatino Linotype" w:cs="Calibri"/>
+                <w:sz w:val="22"/>
+                <w:szCs w:val="22"/>
+                <w:lang w:val="es-ES"/>
+              </w:rPr>
+              <w:t>{#conocimiento2}</w:t>
             </w:r>
             <w:r>
+              <w:rPr>
+                <w:rFonts w:ascii="Palatino Linotype" w:hAnsi="Palatino Linotype" w:cs="Calibri"/>
+                <w:sz w:val="22"/>
+                <w:szCs w:val="22"/>
+                <w:lang w:val="es-ES"/>
+              </w:rPr>
               <w:t>•</w:t>
             </w:r>
-            <w:proofErr w:type="gramEnd"/>
             <w:r>
+              <w:rPr>
+                <w:rFonts w:ascii="Palatino Linotype" w:hAnsi="Palatino Linotype" w:cs="Calibri"/>
+                <w:sz w:val="22"/>
+                <w:szCs w:val="22"/>
+                <w:lang w:val="es-ES"/>
+              </w:rPr>
               <w:t>{conocimiento</w:t>
             </w:r>
             <w:r>
+              <w:rPr>
+                <w:rFonts w:ascii="Palatino Linotype" w:hAnsi="Palatino Linotype" w:cs="Calibri"/>
+                <w:sz w:val="22"/>
+                <w:szCs w:val="22"/>
+                <w:lang w:val="es-ES"/>
+              </w:rPr>
               <w:t>2</w:t>
             </w:r>
             <w:r>
+              <w:rPr>
+                <w:rFonts w:ascii="Palatino Linotype" w:hAnsi="Palatino Linotype" w:cs="Calibri"/>
+                <w:sz w:val="22"/>
+                <w:szCs w:val="22"/>
+                <w:lang w:val="es-ES"/>
+              </w:rPr>
               <w:t>}</w:t>
             </w:r>
             <w:r>
+              <w:rPr>
+                <w:rFonts w:ascii="Palatino Linotype" w:hAnsi="Palatino Linotype" w:cs="Calibri"/>
+                <w:sz w:val="22"/>
+                <w:szCs w:val="22"/>
+                <w:lang w:val="es-ES"/>
+              </w:rPr>
               <w:t>{/conocimiento2}</w:t>
             </w:r>
           </w:p>
@@ -852,30 +943,64 @@
           <w:p>
             <w:pPr>
               <w:rPr>
+                <w:rFonts w:ascii="Palatino Linotype" w:hAnsi="Palatino Linotype" w:cs="Calibri"/>
+                <w:sz w:val="22"/>
+                <w:szCs w:val="22"/>
                 <w:lang w:val="es-ES"/>
               </w:rPr>
             </w:pPr>
             <w:r>
-              <w:t>{#conocimiento</w:t>
-            </w:r>
-            <w:proofErr w:type="gramStart"/>
-            <w:r>
-              <w:t>3}</w:t>
+              <w:rPr>
+                <w:rFonts w:ascii="Palatino Linotype" w:hAnsi="Palatino Linotype" w:cs="Calibri"/>
+                <w:sz w:val="22"/>
+                <w:szCs w:val="22"/>
+                <w:lang w:val="es-ES"/>
+              </w:rPr>
+              <w:t>{#conocimiento3}</w:t>
             </w:r>
             <w:r>
+              <w:rPr>
+                <w:rFonts w:ascii="Palatino Linotype" w:hAnsi="Palatino Linotype" w:cs="Calibri"/>
+                <w:sz w:val="22"/>
+                <w:szCs w:val="22"/>
+                <w:lang w:val="es-ES"/>
+              </w:rPr>
               <w:t>•</w:t>
             </w:r>
-            <w:proofErr w:type="gramEnd"/>
             <w:r>
+              <w:rPr>
+                <w:rFonts w:ascii="Palatino Linotype" w:hAnsi="Palatino Linotype" w:cs="Calibri"/>
+                <w:sz w:val="22"/>
+                <w:szCs w:val="22"/>
+                <w:lang w:val="es-ES"/>
+              </w:rPr>
               <w:t>{conocimiento</w:t>
             </w:r>
             <w:r>
+              <w:rPr>
+                <w:rFonts w:ascii="Palatino Linotype" w:hAnsi="Palatino Linotype" w:cs="Calibri"/>
+                <w:sz w:val="22"/>
+                <w:szCs w:val="22"/>
+                <w:lang w:val="es-ES"/>
+              </w:rPr>
               <w:t>3</w:t>
             </w:r>
             <w:r>
+              <w:rPr>
+                <w:rFonts w:ascii="Palatino Linotype" w:hAnsi="Palatino Linotype" w:cs="Calibri"/>
+                <w:sz w:val="22"/>
+                <w:szCs w:val="22"/>
+                <w:lang w:val="es-ES"/>
+              </w:rPr>
               <w:t>}</w:t>
             </w:r>
             <w:r>
+              <w:rPr>
+                <w:rFonts w:ascii="Palatino Linotype" w:hAnsi="Palatino Linotype" w:cs="Calibri"/>
+                <w:sz w:val="22"/>
+                <w:szCs w:val="22"/>
+                <w:lang w:val="es-ES"/>
+              </w:rPr>
               <w:t>{/conocimiento3}</w:t>
             </w:r>
           </w:p>
@@ -888,33 +1013,73 @@
           <w:p>
             <w:pPr>
               <w:rPr>
+                <w:rFonts w:ascii="Palatino Linotype" w:hAnsi="Palatino Linotype" w:cs="Calibri"/>
+                <w:sz w:val="22"/>
+                <w:szCs w:val="22"/>
                 <w:lang w:val="es-ES"/>
               </w:rPr>
             </w:pPr>
             <w:r>
-              <w:t>{#conocimiento</w:t>
-            </w:r>
-            <w:proofErr w:type="gramStart"/>
-            <w:r>
-              <w:t>4}</w:t>
+              <w:rPr>
+                <w:rFonts w:ascii="Palatino Linotype" w:hAnsi="Palatino Linotype" w:cs="Calibri"/>
+                <w:sz w:val="22"/>
+                <w:szCs w:val="22"/>
+                <w:lang w:val="es-ES"/>
+              </w:rPr>
+              <w:t>{#conocimiento4}</w:t>
             </w:r>
             <w:r>
+              <w:rPr>
+                <w:rFonts w:ascii="Palatino Linotype" w:hAnsi="Palatino Linotype" w:cs="Calibri"/>
+                <w:sz w:val="22"/>
+                <w:szCs w:val="22"/>
+                <w:lang w:val="es-ES"/>
+              </w:rPr>
               <w:t>•</w:t>
             </w:r>
-            <w:proofErr w:type="gramEnd"/>
             <w:r>
+              <w:rPr>
+                <w:rFonts w:ascii="Palatino Linotype" w:hAnsi="Palatino Linotype" w:cs="Calibri"/>
+                <w:sz w:val="22"/>
+                <w:szCs w:val="22"/>
+                <w:lang w:val="es-ES"/>
+              </w:rPr>
               <w:t>{conocimiento</w:t>
             </w:r>
             <w:r>
+              <w:rPr>
+                <w:rFonts w:ascii="Palatino Linotype" w:hAnsi="Palatino Linotype" w:cs="Calibri"/>
+                <w:sz w:val="22"/>
+                <w:szCs w:val="22"/>
+                <w:lang w:val="es-ES"/>
+              </w:rPr>
               <w:t>4</w:t>
             </w:r>
             <w:r>
+              <w:rPr>
+                <w:rFonts w:ascii="Palatino Linotype" w:hAnsi="Palatino Linotype" w:cs="Calibri"/>
+                <w:sz w:val="22"/>
+                <w:szCs w:val="22"/>
+                <w:lang w:val="es-ES"/>
+              </w:rPr>
               <w:t>}</w:t>
             </w:r>
             <w:r>
+              <w:rPr>
+                <w:rFonts w:ascii="Palatino Linotype" w:hAnsi="Palatino Linotype" w:cs="Calibri"/>
+                <w:sz w:val="22"/>
+                <w:szCs w:val="22"/>
+                <w:lang w:val="es-ES"/>
+              </w:rPr>
               <w:t>{/conocimiento4}</w:t>
             </w:r>
             <w:r>
+              <w:rPr>
+                <w:rFonts w:ascii="Palatino Linotype" w:hAnsi="Palatino Linotype" w:cs="Calibri"/>
+                <w:sz w:val="22"/>
+                <w:szCs w:val="22"/>
+                <w:lang w:val="es-ES"/>
+              </w:rPr>
               <w:t>{/}</w:t>
             </w:r>
           </w:p>
@@ -925,78 +1090,62 @@
       <w:pPr>
         <w:spacing w:before="240"/>
         <w:rPr>
-          <w:color w:val="000000" w:themeColor="text1"/>
-          <w:lang w:val="es-ES"/>
-        </w:rPr>
-      </w:pPr>
-      <w:r>
-        <w:rPr>
-          <w:color w:val="000000" w:themeColor="text1"/>
-          <w:lang w:val="es-ES"/>
-        </w:rPr>
-        <w:t>{/</w:t>
-      </w:r>
-      <w:proofErr w:type="spellStart"/>
-      <w:r>
-        <w:rPr>
-          <w:color w:val="000000" w:themeColor="text1"/>
-        </w:rPr>
-        <w:t>tieneConocimientos</w:t>
-      </w:r>
-      <w:proofErr w:type="spellEnd"/>
-      <w:r>
-        <w:rPr>
-          <w:color w:val="000000" w:themeColor="text1"/>
-          <w:lang w:val="es-ES"/>
-        </w:rPr>
-        <w:t>}</w:t>
+          <w:rFonts w:ascii="Palatino Linotype" w:hAnsi="Palatino Linotype" w:cs="Calibri"/>
+          <w:sz w:val="22"/>
+          <w:szCs w:val="22"/>
+          <w:lang w:val="es-ES"/>
+        </w:rPr>
+      </w:pPr>
+      <w:r>
+        <w:rPr>
+          <w:rFonts w:ascii="Palatino Linotype" w:hAnsi="Palatino Linotype" w:cs="Calibri"/>
+          <w:sz w:val="22"/>
+          <w:szCs w:val="22"/>
+          <w:lang w:val="es-ES"/>
+        </w:rPr>
+        <w:t>{/tieneConocimientos}</w:t>
       </w:r>
     </w:p>
     <w:p>
       <w:pPr>
         <w:spacing w:before="240"/>
         <w:rPr>
-          <w:color w:val="000000" w:themeColor="text1"/>
-        </w:rPr>
-      </w:pPr>
-      <w:r>
-        <w:rPr>
-          <w:color w:val="000000" w:themeColor="text1"/>
-          <w:lang w:val="es-ES"/>
-        </w:rPr>
-        <w:t>{#</w:t>
-      </w:r>
-      <w:proofErr w:type="spellStart"/>
-      <w:r>
-        <w:rPr>
-          <w:color w:val="000000" w:themeColor="text1"/>
-        </w:rPr>
-        <w:t>tieneSkills</w:t>
-      </w:r>
-      <w:proofErr w:type="spellEnd"/>
-      <w:r>
-        <w:rPr>
-          <w:color w:val="000000" w:themeColor="text1"/>
-          <w:lang w:val="es-ES"/>
-        </w:rPr>
-        <w:t>}</w:t>
-      </w:r>
-    </w:p>
-    <w:p>
-      <w:pPr>
-        <w:keepNext/>
-        <w:spacing w:before="240" w:after="0"/>
-        <w:rPr>
+          <w:rFonts w:ascii="Palatino Linotype" w:hAnsi="Palatino Linotype" w:cs="Calibri"/>
+          <w:sz w:val="22"/>
+          <w:szCs w:val="22"/>
+          <w:lang w:val="es-ES"/>
+        </w:rPr>
+      </w:pPr>
+      <w:r>
+        <w:rPr>
+          <w:rFonts w:ascii="Palatino Linotype" w:hAnsi="Palatino Linotype" w:cs="Calibri"/>
+          <w:sz w:val="22"/>
+          <w:szCs w:val="22"/>
+          <w:lang w:val="es-ES"/>
+        </w:rPr>
+        <w:t>{#tieneSkills}</w:t>
+      </w:r>
+    </w:p>
+    <w:p>
+      <w:pPr>
+        <w:spacing w:after="0"/>
+        <w:rPr>
+          <w:rFonts w:ascii="Palatino Linotype" w:hAnsi="Palatino Linotype"/>
           <w:b/>
           <w:bCs/>
+          <w:i/>
+          <w:iCs/>
           <w:color w:val="0070C0"/>
           <w:lang w:val="es-ES"/>
         </w:rPr>
       </w:pPr>
       <w:r>
         <w:rPr>
+          <w:rFonts w:ascii="Palatino Linotype" w:hAnsi="Palatino Linotype"/>
           <w:b/>
           <w:bCs/>
+          <w:i/>
+          <w:iCs/>
           <w:color w:val="0070C0"/>
           <w:lang w:val="es-ES"/>
         </w:rPr>
@@ -1011,7 +1160,6 @@
           <w:b/>
           <w:bCs/>
           <w:color w:val="000000" w:themeColor="text1"/>
-          <w:lang w:val="es-ES"/>
         </w:rPr>
       </w:pPr>
       <w:r>
@@ -1022,20 +1170,27 @@
         </w:rPr>
         <w:t>‾‾‾‾‾‾‾‾‾‾‾‾‾‾‾‾‾‾‾‾‾‾‾‾‾‾‾‾‾‾‾‾‾‾‾‾‾‾‾‾‾‾‾‾‾‾‾‾‾‾‾‾‾‾‾‾‾‾‾‾‾‾‾‾‾‾‾‾‾‾‾‾‾‾‾‾‾‾‾‾‾‾‾‾‾‾‾‾‾‾‾‾‾‾‾‾‾</w:t>
       </w:r>
+      <w:r>
+        <w:rPr>
+          <w:b/>
+          <w:bCs/>
+          <w:color w:val="000000" w:themeColor="text1"/>
+        </w:rPr>
+        <w:t>‾‾‾‾‾‾‾‾‾‾‾‾‾‾‾‾‾‾‾‾‾‾‾‾‾‾‾‾‾‾‾‾</w:t>
+      </w:r>
+      <w:r>
+        <w:rPr>
+          <w:b/>
+          <w:bCs/>
+          <w:color w:val="000000" w:themeColor="text1"/>
+        </w:rPr>
+        <w:t>‾</w:t>
+      </w:r>
     </w:p>
     <w:tbl>
       <w:tblPr>
-        <w:tblStyle w:val="Tablaconcuadrcula"/>
+        <w:tblStyle w:val="Tablanormal4"/>
         <w:tblW w:w="0" w:type="auto"/>
-        <w:jc w:val="center"/>
-        <w:tblBorders>
-          <w:top w:val="none" w:sz="0" w:space="0" w:color="auto"/>
-          <w:left w:val="none" w:sz="0" w:space="0" w:color="auto"/>
-          <w:bottom w:val="none" w:sz="0" w:space="0" w:color="auto"/>
-          <w:right w:val="none" w:sz="0" w:space="0" w:color="auto"/>
-          <w:insideH w:val="none" w:sz="0" w:space="0" w:color="auto"/>
-          <w:insideV w:val="none" w:sz="0" w:space="0" w:color="auto"/>
-        </w:tblBorders>
         <w:tblLayout w:type="fixed"/>
         <w:tblLook w:val="04A0" w:firstRow="1" w:lastRow="0" w:firstColumn="1" w:lastColumn="0" w:noHBand="0" w:noVBand="1"/>
       </w:tblPr>
@@ -1047,203 +1202,174 @@
       </w:tblGrid>
       <w:tr>
         <w:trPr>
-          <w:jc w:val="center"/>
+          <w:cnfStyle w:val="100000000000" w:firstRow="1" w:lastRow="0" w:firstColumn="0" w:lastColumn="0" w:oddVBand="0" w:evenVBand="0" w:oddHBand="0" w:evenHBand="0" w:firstRowFirstColumn="0" w:firstRowLastColumn="0" w:lastRowFirstColumn="0" w:lastRowLastColumn="0"/>
+          <w:trHeight w:val="510"/>
         </w:trPr>
         <w:tc>
           <w:tcPr>
+            <w:cnfStyle w:val="001000000000" w:firstRow="0" w:lastRow="0" w:firstColumn="1" w:lastColumn="0" w:oddVBand="0" w:evenVBand="0" w:oddHBand="0" w:evenHBand="0" w:firstRowFirstColumn="0" w:firstRowLastColumn="0" w:lastRowFirstColumn="0" w:lastRowLastColumn="0"/>
             <w:tcW w:w="2700" w:type="dxa"/>
-            <w:vAlign w:val="center"/>
+            <w:shd w:val="clear" w:color="auto" w:fill="auto"/>
           </w:tcPr>
           <w:p>
             <w:pPr>
               <w:rPr>
+                <w:rFonts w:ascii="Palatino Linotype" w:hAnsi="Palatino Linotype" w:cs="Calibri"/>
+                <w:sz w:val="22"/>
+                <w:szCs w:val="22"/>
                 <w:lang w:val="es-ES"/>
               </w:rPr>
             </w:pPr>
             <w:r>
-              <w:t>{#</w:t>
-            </w:r>
-            <w:proofErr w:type="gramStart"/>
-            <w:r>
-              <w:t>habilidades}</w:t>
+              <w:rPr>
+                <w:rFonts w:ascii="Palatino Linotype" w:hAnsi="Palatino Linotype" w:cs="Calibri"/>
+                <w:b w:val="0"/>
+                <w:sz w:val="22"/>
+                <w:szCs w:val="22"/>
+                <w:lang w:val="es-ES"/>
+              </w:rPr>
+              <w:t>{#habilid</w:t>
             </w:r>
             <w:r>
-              <w:t>{</w:t>
-            </w:r>
-            <w:proofErr w:type="gramEnd"/>
-            <w:r>
-              <w:t>#</w:t>
+              <w:rPr>
+                <w:rFonts w:ascii="Palatino Linotype" w:hAnsi="Palatino Linotype" w:cs="Calibri"/>
+                <w:b w:val="0"/>
+                <w:sz w:val="22"/>
+                <w:szCs w:val="22"/>
+                <w:lang w:val="es-ES"/>
+              </w:rPr>
+              <w:t>ades}{#skill1}•</w:t>
             </w:r>
             <w:r>
-              <w:t>skill</w:t>
-            </w:r>
-            <w:r>
-              <w:t>1}</w:t>
-            </w:r>
-            <w:r>
-              <w:t>•</w:t>
-            </w:r>
-            <w:r>
-              <w:t>{skill</w:t>
-            </w:r>
-            <w:r>
-              <w:t>1</w:t>
-            </w:r>
-            <w:r>
-              <w:t>}{/</w:t>
-            </w:r>
-            <w:r>
-              <w:t>skill</w:t>
-            </w:r>
-            <w:r>
-              <w:t>1</w:t>
-            </w:r>
-            <w:r>
-              <w:t>}</w:t>
+              <w:rPr>
+                <w:rFonts w:ascii="Palatino Linotype" w:hAnsi="Palatino Linotype" w:cs="Calibri"/>
+                <w:b w:val="0"/>
+                <w:sz w:val="22"/>
+                <w:szCs w:val="22"/>
+                <w:lang w:val="es-ES"/>
+              </w:rPr>
+              <w:t>{skill1}{/skill1}</w:t>
             </w:r>
           </w:p>
         </w:tc>
         <w:tc>
           <w:tcPr>
             <w:tcW w:w="2700" w:type="dxa"/>
-            <w:vAlign w:val="center"/>
+            <w:shd w:val="clear" w:color="auto" w:fill="auto"/>
           </w:tcPr>
           <w:p>
             <w:pPr>
-              <w:rPr>
+              <w:cnfStyle w:val="100000000000" w:firstRow="1" w:lastRow="0" w:firstColumn="0" w:lastColumn="0" w:oddVBand="0" w:evenVBand="0" w:oddHBand="0" w:evenHBand="0" w:firstRowFirstColumn="0" w:firstRowLastColumn="0" w:lastRowFirstColumn="0" w:lastRowLastColumn="0"/>
+              <w:rPr>
+                <w:rFonts w:ascii="Palatino Linotype" w:hAnsi="Palatino Linotype" w:cs="Calibri"/>
+                <w:sz w:val="22"/>
+                <w:szCs w:val="22"/>
                 <w:lang w:val="es-ES"/>
               </w:rPr>
             </w:pPr>
             <w:r>
-              <w:t>{#</w:t>
+              <w:rPr>
+                <w:rFonts w:ascii="Palatino Linotype" w:hAnsi="Palatino Linotype" w:cs="Calibri"/>
+                <w:b w:val="0"/>
+                <w:sz w:val="22"/>
+                <w:szCs w:val="22"/>
+                <w:lang w:val="es-ES"/>
+              </w:rPr>
+              <w:t>{#skill2}•</w:t>
             </w:r>
             <w:r>
-              <w:t>skill</w:t>
-            </w:r>
-            <w:proofErr w:type="gramStart"/>
-            <w:r>
-              <w:t>2}</w:t>
-            </w:r>
-            <w:r>
-              <w:t>•</w:t>
-            </w:r>
-            <w:proofErr w:type="gramEnd"/>
-            <w:r>
-              <w:t>{</w:t>
-            </w:r>
-            <w:r>
-              <w:t>skill2</w:t>
-            </w:r>
-            <w:r>
-              <w:t>}</w:t>
-            </w:r>
-            <w:r>
-              <w:t>{/</w:t>
-            </w:r>
-            <w:r>
-              <w:t>skill2</w:t>
-            </w:r>
-            <w:r>
-              <w:t>}</w:t>
+              <w:rPr>
+                <w:rFonts w:ascii="Palatino Linotype" w:hAnsi="Palatino Linotype" w:cs="Calibri"/>
+                <w:b w:val="0"/>
+                <w:sz w:val="22"/>
+                <w:szCs w:val="22"/>
+                <w:lang w:val="es-ES"/>
+              </w:rPr>
+              <w:t>{skill2}{/skill2}</w:t>
             </w:r>
           </w:p>
         </w:tc>
         <w:tc>
           <w:tcPr>
             <w:tcW w:w="2700" w:type="dxa"/>
-            <w:vAlign w:val="center"/>
+            <w:shd w:val="clear" w:color="auto" w:fill="auto"/>
           </w:tcPr>
           <w:p>
             <w:pPr>
-              <w:rPr>
+              <w:cnfStyle w:val="100000000000" w:firstRow="1" w:lastRow="0" w:firstColumn="0" w:lastColumn="0" w:oddVBand="0" w:evenVBand="0" w:oddHBand="0" w:evenHBand="0" w:firstRowFirstColumn="0" w:firstRowLastColumn="0" w:lastRowFirstColumn="0" w:lastRowLastColumn="0"/>
+              <w:rPr>
+                <w:rFonts w:ascii="Palatino Linotype" w:hAnsi="Palatino Linotype" w:cs="Calibri"/>
+                <w:sz w:val="22"/>
+                <w:szCs w:val="22"/>
                 <w:lang w:val="es-ES"/>
               </w:rPr>
             </w:pPr>
             <w:r>
-              <w:t>{#</w:t>
+              <w:rPr>
+                <w:rFonts w:ascii="Palatino Linotype" w:hAnsi="Palatino Linotype" w:cs="Calibri"/>
+                <w:b w:val="0"/>
+                <w:sz w:val="22"/>
+                <w:szCs w:val="22"/>
+                <w:lang w:val="es-ES"/>
+              </w:rPr>
+              <w:t>{#skill3}•</w:t>
             </w:r>
             <w:r>
-              <w:t>skill</w:t>
-            </w:r>
-            <w:proofErr w:type="gramStart"/>
-            <w:r>
-              <w:t>3}</w:t>
-            </w:r>
-            <w:r>
-              <w:t>•</w:t>
-            </w:r>
-            <w:proofErr w:type="gramEnd"/>
-            <w:r>
-              <w:t>{</w:t>
-            </w:r>
-            <w:r>
-              <w:t>skill3</w:t>
-            </w:r>
-            <w:r>
-              <w:t>}</w:t>
-            </w:r>
-            <w:r>
-              <w:t>{/</w:t>
-            </w:r>
-            <w:r>
-              <w:t>skill3</w:t>
-            </w:r>
-            <w:r>
-              <w:t>}</w:t>
+              <w:rPr>
+                <w:rFonts w:ascii="Palatino Linotype" w:hAnsi="Palatino Linotype" w:cs="Calibri"/>
+                <w:b w:val="0"/>
+                <w:sz w:val="22"/>
+                <w:szCs w:val="22"/>
+                <w:lang w:val="es-ES"/>
+              </w:rPr>
+              <w:t>{skill3}{/skill3}</w:t>
             </w:r>
           </w:p>
         </w:tc>
         <w:tc>
           <w:tcPr>
             <w:tcW w:w="2700" w:type="dxa"/>
-            <w:vAlign w:val="center"/>
+            <w:shd w:val="clear" w:color="auto" w:fill="auto"/>
           </w:tcPr>
           <w:p>
             <w:pPr>
-              <w:rPr>
+              <w:cnfStyle w:val="100000000000" w:firstRow="1" w:lastRow="0" w:firstColumn="0" w:lastColumn="0" w:oddVBand="0" w:evenVBand="0" w:oddHBand="0" w:evenHBand="0" w:firstRowFirstColumn="0" w:firstRowLastColumn="0" w:lastRowFirstColumn="0" w:lastRowLastColumn="0"/>
+              <w:rPr>
+                <w:rFonts w:ascii="Palatino Linotype" w:hAnsi="Palatino Linotype" w:cs="Calibri"/>
+                <w:sz w:val="22"/>
+                <w:szCs w:val="22"/>
                 <w:lang w:val="es-ES"/>
               </w:rPr>
             </w:pPr>
             <w:r>
-              <w:t>{#</w:t>
+              <w:rPr>
+                <w:rFonts w:ascii="Palatino Linotype" w:hAnsi="Palatino Linotype" w:cs="Calibri"/>
+                <w:b w:val="0"/>
+                <w:sz w:val="22"/>
+                <w:szCs w:val="22"/>
+                <w:lang w:val="es-ES"/>
+              </w:rPr>
+              <w:t>{#skill4}</w:t>
             </w:r>
             <w:r>
-              <w:t>skill</w:t>
-            </w:r>
-            <w:proofErr w:type="gramStart"/>
-            <w:r>
-              <w:t>4}</w:t>
+              <w:rPr>
+                <w:rFonts w:ascii="Palatino Linotype" w:hAnsi="Palatino Linotype" w:cs="Calibri"/>
+                <w:b w:val="0"/>
+                <w:sz w:val="22"/>
+                <w:szCs w:val="22"/>
+                <w:lang w:val="es-ES"/>
+              </w:rPr>
+              <w:t>•</w:t>
             </w:r>
             <w:r>
-              <w:t>•</w:t>
-            </w:r>
-            <w:proofErr w:type="gramEnd"/>
-            <w:r>
-              <w:t>{</w:t>
-            </w:r>
-            <w:r>
-              <w:t>skill</w:t>
-            </w:r>
-            <w:r>
-              <w:t>4</w:t>
-            </w:r>
-            <w:r>
-              <w:t>}</w:t>
-            </w:r>
-            <w:r>
-              <w:t>{/</w:t>
-            </w:r>
-            <w:r>
-              <w:t>skill</w:t>
-            </w:r>
-            <w:r>
-              <w:t>4}</w:t>
-            </w:r>
-            <w:r>
-              <w:t>{</w:t>
-            </w:r>
-            <w:r>
-              <w:t>/}</w:t>
+              <w:rPr>
+                <w:rFonts w:ascii="Palatino Linotype" w:hAnsi="Palatino Linotype" w:cs="Calibri"/>
+                <w:b w:val="0"/>
+                <w:sz w:val="22"/>
+                <w:szCs w:val="22"/>
+                <w:lang w:val="es-ES"/>
+              </w:rPr>
+              <w:t>{skill4}{/skill4}{/}</w:t>
             </w:r>
           </w:p>
         </w:tc>
@@ -1251,33 +1377,33 @@
     </w:tbl>
     <w:p>
       <w:pPr>
-        <w:jc w:val="both"/>
-        <w:rPr>
-          <w:color w:val="000000" w:themeColor="text1"/>
-          <w:lang w:val="es-ES"/>
-        </w:rPr>
-      </w:pPr>
-      <w:r>
-        <w:rPr>
-          <w:color w:val="000000" w:themeColor="text1"/>
-          <w:lang w:val="es-ES"/>
-        </w:rPr>
-        <w:t>{/</w:t>
-      </w:r>
-      <w:proofErr w:type="spellStart"/>
-      <w:r>
-        <w:rPr>
-          <w:lang w:val="es-ES"/>
-        </w:rPr>
-        <w:t>tieneSkills</w:t>
-      </w:r>
-      <w:proofErr w:type="spellEnd"/>
-      <w:r>
-        <w:rPr>
-          <w:color w:val="000000" w:themeColor="text1"/>
-          <w:lang w:val="es-ES"/>
-        </w:rPr>
-        <w:t>}</w:t>
+        <w:spacing w:after="0" w:line="240" w:lineRule="auto"/>
+        <w:rPr>
+          <w:rFonts w:ascii="Palatino Linotype" w:hAnsi="Palatino Linotype" w:cs="Calibri"/>
+          <w:sz w:val="22"/>
+          <w:szCs w:val="22"/>
+          <w:lang w:val="es-ES"/>
+        </w:rPr>
+      </w:pPr>
+    </w:p>
+    <w:p>
+      <w:pPr>
+        <w:spacing w:after="0" w:line="240" w:lineRule="auto"/>
+        <w:rPr>
+          <w:rFonts w:ascii="Palatino Linotype" w:hAnsi="Palatino Linotype" w:cs="Calibri"/>
+          <w:sz w:val="22"/>
+          <w:szCs w:val="22"/>
+          <w:lang w:val="es-ES"/>
+        </w:rPr>
+      </w:pPr>
+      <w:r>
+        <w:rPr>
+          <w:rFonts w:ascii="Palatino Linotype" w:hAnsi="Palatino Linotype" w:cs="Calibri"/>
+          <w:sz w:val="22"/>
+          <w:szCs w:val="22"/>
+          <w:lang w:val="es-ES"/>
+        </w:rPr>
+        <w:t>{/tieneSkills}</w:t>
       </w:r>
     </w:p>
     <w:p>
@@ -1290,10 +1416,11 @@
           <w:lang w:val="es-ES"/>
         </w:rPr>
       </w:pPr>
-    </w:p>
-    <w:p>
-      <w:pPr>
-        <w:keepNext/>
+      <w:bookmarkStart w:id="0" w:name="_GoBack"/>
+      <w:bookmarkEnd w:id="0"/>
+    </w:p>
+    <w:p>
+      <w:pPr>
         <w:spacing w:after="0"/>
         <w:rPr>
           <w:b/>
@@ -1304,12 +1431,14 @@
       </w:pPr>
       <w:r>
         <w:rPr>
+          <w:rFonts w:ascii="Palatino Linotype" w:hAnsi="Palatino Linotype"/>
           <w:b/>
           <w:bCs/>
+          <w:i/>
+          <w:iCs/>
           <w:color w:val="0070C0"/>
           <w:lang w:val="es-ES"/>
         </w:rPr>
-        <w:lastRenderedPageBreak/>
         <w:t>EXPERIENCIA LABORAL</w:t>
       </w:r>
     </w:p>
@@ -1330,502 +1459,524 @@
           <w:bCs/>
           <w:color w:val="000000" w:themeColor="text1"/>
         </w:rPr>
+        <w:lastRenderedPageBreak/>
         <w:t>‾‾‾‾‾‾‾‾‾‾‾‾‾‾‾‾‾‾‾‾‾‾‾‾‾‾‾‾‾‾‾‾‾‾‾‾‾‾‾‾‾‾‾‾‾‾‾‾‾‾‾‾‾‾‾‾‾‾‾‾‾‾‾‾‾‾‾‾‾‾‾‾‾‾‾‾‾‾‾‾‾‾‾‾‾‾‾‾‾‾‾‾‾‾‾‾‾</w:t>
       </w:r>
-    </w:p>
-    <w:p>
-      <w:pPr>
-        <w:keepNext/>
-        <w:spacing w:after="0"/>
-        <w:jc w:val="both"/>
-      </w:pPr>
-      <w:r>
-        <w:rPr>
-          <w:lang w:val="es-ES"/>
-        </w:rPr>
-        <w:t>{#</w:t>
-      </w:r>
-      <w:r>
-        <w:t>experiencias</w:t>
-      </w:r>
-      <w:r>
-        <w:rPr>
-          <w:lang w:val="es-ES"/>
-        </w:rPr>
-        <w:t>}</w:t>
-      </w:r>
-    </w:p>
-    <w:p>
-      <w:pPr>
-        <w:keepNext/>
-        <w:spacing w:after="0"/>
-        <w:jc w:val="both"/>
-        <w:rPr>
-          <w:b/>
-          <w:bCs/>
-          <w:lang w:val="es-ES"/>
-        </w:rPr>
-      </w:pPr>
-      <w:r>
-        <w:rPr>
-          <w:lang w:val="es-ES"/>
-        </w:rPr>
-        <w:t>Puesto</w:t>
-      </w:r>
-      <w:r>
-        <w:rPr>
-          <w:lang w:val="es-ES"/>
-        </w:rPr>
-        <w:t>:</w:t>
-      </w:r>
-      <w:r>
-        <w:rPr>
-          <w:b/>
-          <w:bCs/>
-          <w:lang w:val="es-ES"/>
-        </w:rPr>
-        <w:t xml:space="preserve"> {</w:t>
-      </w:r>
-      <w:r>
-        <w:rPr>
-          <w:b/>
-          <w:bCs/>
-          <w:lang w:val="es-ES"/>
-        </w:rPr>
-        <w:t>puesto</w:t>
-      </w:r>
-      <w:r>
-        <w:rPr>
-          <w:b/>
-          <w:bCs/>
-          <w:lang w:val="es-ES"/>
-        </w:rPr>
-        <w:t>}</w:t>
-      </w:r>
-    </w:p>
-    <w:p>
-      <w:pPr>
-        <w:spacing w:after="0"/>
-        <w:jc w:val="both"/>
-        <w:rPr>
-          <w:b/>
-          <w:bCs/>
-          <w:u w:val="single"/>
-          <w:lang w:val="es-ES"/>
-        </w:rPr>
-      </w:pPr>
-      <w:r>
-        <w:rPr>
-          <w:lang w:val="es-ES"/>
-        </w:rPr>
-        <w:t>Empresa</w:t>
-      </w:r>
-      <w:r>
-        <w:rPr>
-          <w:lang w:val="es-ES"/>
-        </w:rPr>
-        <w:t>:</w:t>
-      </w:r>
-      <w:r>
-        <w:rPr>
-          <w:b/>
-          <w:bCs/>
-          <w:lang w:val="es-ES"/>
-        </w:rPr>
-        <w:t xml:space="preserve"> {</w:t>
-      </w:r>
-      <w:r>
-        <w:rPr>
-          <w:b/>
-          <w:bCs/>
-          <w:lang w:val="es-ES"/>
-        </w:rPr>
-        <w:t>empresa</w:t>
-      </w:r>
-      <w:r>
-        <w:rPr>
-          <w:b/>
-          <w:bCs/>
-          <w:lang w:val="es-ES"/>
-        </w:rPr>
-        <w:t>}</w:t>
-      </w:r>
-    </w:p>
-    <w:p>
-      <w:pPr>
-        <w:spacing w:after="240"/>
-        <w:jc w:val="both"/>
-        <w:rPr>
-          <w:b/>
-          <w:bCs/>
-          <w:lang w:val="es-ES"/>
-        </w:rPr>
-      </w:pPr>
-      <w:r>
-        <w:rPr>
-          <w:lang w:val="es-ES"/>
-        </w:rPr>
-        <w:t>Fecha</w:t>
-      </w:r>
-      <w:r>
-        <w:rPr>
-          <w:lang w:val="es-ES"/>
-        </w:rPr>
-        <w:t>:</w:t>
-      </w:r>
-      <w:r>
-        <w:rPr>
-          <w:b/>
-          <w:bCs/>
-          <w:lang w:val="es-ES"/>
-        </w:rPr>
-        <w:t xml:space="preserve"> {</w:t>
-      </w:r>
-      <w:r>
-        <w:rPr>
-          <w:b/>
-          <w:bCs/>
-          <w:lang w:val="es-ES"/>
-        </w:rPr>
-        <w:t>periodo</w:t>
-      </w:r>
-      <w:r>
-        <w:rPr>
-          <w:b/>
-          <w:bCs/>
-          <w:lang w:val="es-ES"/>
-        </w:rPr>
-        <w:t>}</w:t>
-      </w:r>
-    </w:p>
-    <w:p>
-      <w:pPr>
-        <w:ind w:left="708"/>
-        <w:jc w:val="both"/>
-        <w:rPr>
-          <w:lang w:val="es-ES"/>
-        </w:rPr>
-      </w:pPr>
-      <w:r>
-        <w:rPr>
-          <w:lang w:val="es-ES"/>
-        </w:rPr>
-        <w:t>{</w:t>
-      </w:r>
-      <w:proofErr w:type="spellStart"/>
-      <w:r>
-        <w:t>descripcion</w:t>
-      </w:r>
-      <w:proofErr w:type="spellEnd"/>
-      <w:r>
-        <w:rPr>
-          <w:lang w:val="es-ES"/>
-        </w:rPr>
-        <w:t>}</w:t>
-      </w:r>
-    </w:p>
-    <w:p>
-      <w:pPr>
-        <w:spacing w:after="0"/>
-        <w:jc w:val="both"/>
-        <w:rPr>
-          <w:lang w:val="es-ES"/>
-        </w:rPr>
-      </w:pPr>
-      <w:r>
-        <w:rPr>
-          <w:lang w:val="es-ES"/>
-        </w:rPr>
-        <w:t>{/</w:t>
-      </w:r>
-      <w:r>
-        <w:t>experiencias</w:t>
-      </w:r>
-      <w:r>
-        <w:rPr>
-          <w:lang w:val="es-ES"/>
-        </w:rPr>
-        <w:t>}</w:t>
-      </w:r>
-    </w:p>
-    <w:p>
-      <w:pPr>
-        <w:jc w:val="both"/>
-        <w:rPr>
-          <w:lang w:val="es-ES"/>
-        </w:rPr>
-      </w:pPr>
-      <w:r>
-        <w:rPr>
-          <w:lang w:val="es-ES"/>
-        </w:rPr>
-        <w:t>{#tieneCursos}</w:t>
-      </w:r>
-    </w:p>
-    <w:p>
-      <w:pPr>
-        <w:spacing w:after="0"/>
-        <w:rPr>
-          <w:b/>
-          <w:bCs/>
-          <w:color w:val="0070C0"/>
-          <w:lang w:val="es-ES"/>
-        </w:rPr>
-      </w:pPr>
-      <w:r>
-        <w:rPr>
-          <w:b/>
-          <w:bCs/>
-          <w:color w:val="0070C0"/>
-          <w:lang w:val="es-ES"/>
-        </w:rPr>
-        <w:t>OTROS ESTUDIOS</w:t>
-      </w:r>
-    </w:p>
-    <w:p>
-      <w:pPr>
-        <w:spacing w:after="0"/>
+      <w:r>
         <w:rPr>
           <w:b/>
           <w:bCs/>
           <w:color w:val="000000" w:themeColor="text1"/>
-          <w:lang w:val="es-ES"/>
-        </w:rPr>
-      </w:pPr>
-      <w:r>
+        </w:rPr>
+        <w:t>‾‾‾‾‾‾‾‾‾‾‾‾‾‾‾‾‾‾‾‾‾‾‾‾‾‾‾‾‾‾‾‾</w:t>
+      </w:r>
+    </w:p>
+    <w:p>
+      <w:pPr>
+        <w:spacing w:after="0"/>
+        <w:jc w:val="both"/>
+        <w:rPr>
+          <w:rFonts w:ascii="Palatino Linotype" w:hAnsi="Palatino Linotype" w:cs="Calibri"/>
+          <w:sz w:val="22"/>
+          <w:szCs w:val="22"/>
+          <w:lang w:val="es-ES"/>
+        </w:rPr>
+      </w:pPr>
+      <w:r>
+        <w:rPr>
+          <w:rFonts w:ascii="Palatino Linotype" w:hAnsi="Palatino Linotype" w:cs="Calibri"/>
+          <w:sz w:val="22"/>
+          <w:szCs w:val="22"/>
+          <w:lang w:val="es-ES"/>
+        </w:rPr>
+        <w:t>{#experiencias}</w:t>
+      </w:r>
+    </w:p>
+    <w:p>
+      <w:pPr>
+        <w:spacing w:after="0"/>
+        <w:jc w:val="both"/>
+        <w:rPr>
+          <w:rFonts w:ascii="Palatino Linotype" w:hAnsi="Palatino Linotype" w:cs="Calibri"/>
+          <w:b/>
+          <w:sz w:val="22"/>
+          <w:szCs w:val="22"/>
+          <w:lang w:val="es-ES"/>
+        </w:rPr>
+      </w:pPr>
+      <w:r>
+        <w:rPr>
+          <w:rFonts w:ascii="Palatino Linotype" w:hAnsi="Palatino Linotype" w:cs="Calibri"/>
+          <w:b/>
+          <w:sz w:val="22"/>
+          <w:szCs w:val="22"/>
+          <w:lang w:val="es-ES"/>
+        </w:rPr>
+        <w:t>{puesto}</w:t>
+      </w:r>
+    </w:p>
+    <w:p>
+      <w:pPr>
+        <w:spacing w:after="0"/>
+        <w:jc w:val="both"/>
+        <w:rPr>
+          <w:rFonts w:ascii="Palatino Linotype" w:hAnsi="Palatino Linotype" w:cs="Calibri"/>
+          <w:b/>
+          <w:sz w:val="22"/>
+          <w:szCs w:val="22"/>
+          <w:lang w:val="es-ES"/>
+        </w:rPr>
+      </w:pPr>
+      <w:r>
+        <w:rPr>
+          <w:rFonts w:ascii="Palatino Linotype" w:hAnsi="Palatino Linotype" w:cs="Calibri"/>
+          <w:b/>
+          <w:sz w:val="22"/>
+          <w:szCs w:val="22"/>
+          <w:lang w:val="es-ES"/>
+        </w:rPr>
+        <w:t>{empresa}</w:t>
+      </w:r>
+    </w:p>
+    <w:p>
+      <w:pPr>
+        <w:spacing w:after="0"/>
+        <w:jc w:val="both"/>
+        <w:rPr>
+          <w:rFonts w:ascii="Palatino Linotype" w:hAnsi="Palatino Linotype" w:cs="Calibri"/>
+          <w:b/>
+          <w:sz w:val="22"/>
+          <w:szCs w:val="22"/>
+          <w:lang w:val="es-ES"/>
+        </w:rPr>
+      </w:pPr>
+      <w:r>
+        <w:rPr>
+          <w:rFonts w:ascii="Palatino Linotype" w:hAnsi="Palatino Linotype" w:cs="Calibri"/>
+          <w:b/>
+          <w:sz w:val="22"/>
+          <w:szCs w:val="22"/>
+          <w:lang w:val="es-ES"/>
+        </w:rPr>
+        <w:t>{periodo}</w:t>
+      </w:r>
+    </w:p>
+    <w:p>
+      <w:pPr>
+        <w:spacing w:after="0"/>
+        <w:rPr>
+          <w:rFonts w:ascii="Palatino Linotype" w:hAnsi="Palatino Linotype" w:cs="Calibri"/>
+          <w:sz w:val="22"/>
+          <w:szCs w:val="22"/>
+          <w:lang w:val="es-ES"/>
+        </w:rPr>
+      </w:pPr>
+    </w:p>
+    <w:p>
+      <w:pPr>
+        <w:spacing w:after="0"/>
+        <w:rPr>
+          <w:rFonts w:ascii="Palatino Linotype" w:hAnsi="Palatino Linotype" w:cs="Calibri"/>
+          <w:sz w:val="22"/>
+          <w:szCs w:val="22"/>
+          <w:lang w:val="es-ES"/>
+        </w:rPr>
+      </w:pPr>
+      <w:r>
+        <w:rPr>
+          <w:rFonts w:ascii="Palatino Linotype" w:hAnsi="Palatino Linotype" w:cs="Calibri"/>
+          <w:sz w:val="22"/>
+          <w:szCs w:val="22"/>
+          <w:lang w:val="es-ES"/>
+        </w:rPr>
+        <w:t>{#descripciones}•{.}</w:t>
+      </w:r>
+    </w:p>
+    <w:p>
+      <w:pPr>
+        <w:spacing w:after="0"/>
+        <w:rPr>
+          <w:rFonts w:ascii="Palatino Linotype" w:hAnsi="Palatino Linotype" w:cs="Calibri"/>
+          <w:sz w:val="22"/>
+          <w:szCs w:val="22"/>
+          <w:lang w:val="es-ES"/>
+        </w:rPr>
+      </w:pPr>
+      <w:r>
+        <w:rPr>
+          <w:rFonts w:ascii="Palatino Linotype" w:hAnsi="Palatino Linotype" w:cs="Calibri"/>
+          <w:sz w:val="22"/>
+          <w:szCs w:val="22"/>
+          <w:lang w:val="es-ES"/>
+        </w:rPr>
+        <w:t>{/descripciones}</w:t>
+      </w:r>
+    </w:p>
+    <w:p>
+      <w:pPr>
+        <w:spacing w:after="0"/>
+        <w:jc w:val="both"/>
+        <w:rPr>
+          <w:rFonts w:ascii="Palatino Linotype" w:hAnsi="Palatino Linotype" w:cs="Calibri"/>
+          <w:sz w:val="22"/>
+          <w:szCs w:val="22"/>
+          <w:lang w:val="es-ES"/>
+        </w:rPr>
+      </w:pPr>
+      <w:r>
+        <w:rPr>
+          <w:rFonts w:ascii="Palatino Linotype" w:hAnsi="Palatino Linotype" w:cs="Calibri"/>
+          <w:sz w:val="22"/>
+          <w:szCs w:val="22"/>
+          <w:lang w:val="es-ES"/>
+        </w:rPr>
+        <w:t>{/experiencias}</w:t>
+      </w:r>
+    </w:p>
+    <w:p>
+      <w:pPr>
+        <w:spacing w:after="0"/>
+        <w:jc w:val="both"/>
+        <w:rPr>
+          <w:rFonts w:ascii="Palatino Linotype" w:hAnsi="Palatino Linotype" w:cs="Calibri"/>
+          <w:sz w:val="22"/>
+          <w:szCs w:val="22"/>
+          <w:lang w:val="es-ES"/>
+        </w:rPr>
+      </w:pPr>
+      <w:r>
+        <w:rPr>
+          <w:rFonts w:ascii="Palatino Linotype" w:hAnsi="Palatino Linotype" w:cs="Calibri"/>
+          <w:sz w:val="22"/>
+          <w:szCs w:val="22"/>
+          <w:lang w:val="es-ES"/>
+        </w:rPr>
+        <w:t>{#tieneCursos}</w:t>
+      </w:r>
+    </w:p>
+    <w:p>
+      <w:pPr>
+        <w:spacing w:after="0"/>
+        <w:rPr>
+          <w:rFonts w:ascii="Palatino Linotype" w:hAnsi="Palatino Linotype"/>
+          <w:b/>
+          <w:bCs/>
+          <w:i/>
+          <w:iCs/>
+          <w:color w:val="0070C0"/>
+          <w:u w:val="single"/>
+          <w:lang w:val="es-ES"/>
+        </w:rPr>
+      </w:pPr>
+      <w:r>
+        <w:rPr>
+          <w:rFonts w:ascii="Palatino Linotype" w:hAnsi="Palatino Linotype"/>
+          <w:b/>
+          <w:bCs/>
+          <w:i/>
+          <w:iCs/>
+          <w:color w:val="0070C0"/>
+          <w:lang w:val="es-ES"/>
+        </w:rPr>
+        <w:t>CERTIFICACIONES</w:t>
+      </w:r>
+    </w:p>
+    <w:p>
+      <w:pPr>
+        <w:spacing w:after="0"/>
         <w:rPr>
           <w:b/>
           <w:bCs/>
           <w:color w:val="000000" w:themeColor="text1"/>
-        </w:rPr>
-        <w:t>‾‾‾‾‾‾‾‾‾‾‾‾‾‾‾‾‾‾‾‾‾‾‾‾‾‾‾‾‾‾‾‾‾‾‾‾‾‾‾‾‾‾‾‾‾‾‾‾‾‾‾‾‾‾‾‾‾‾‾‾‾‾‾‾‾‾‾‾‾‾‾‾‾‾‾‾‾‾‾‾‾‾‾‾‾‾‾‾‾‾‾‾‾‾‾‾‾</w:t>
-      </w:r>
-    </w:p>
-    <w:p>
-      <w:pPr>
-        <w:spacing w:after="0"/>
-        <w:jc w:val="both"/>
-      </w:pPr>
-      <w:r>
-        <w:t>{#cursos}</w:t>
-      </w:r>
-    </w:p>
-    <w:p>
-      <w:pPr>
-        <w:spacing w:after="0"/>
-        <w:jc w:val="both"/>
-        <w:rPr>
-          <w:b/>
-          <w:bCs/>
-        </w:rPr>
-      </w:pPr>
-      <w:r>
-        <w:rPr>
-          <w:b/>
-          <w:bCs/>
-        </w:rPr>
-        <w:t>{nombre}</w:t>
-      </w:r>
-    </w:p>
-    <w:p>
-      <w:pPr>
-        <w:spacing w:after="0"/>
-        <w:jc w:val="both"/>
-        <w:rPr>
-          <w:b/>
-          <w:bCs/>
-        </w:rPr>
-      </w:pPr>
-      <w:r>
-        <w:rPr>
-          <w:b/>
-          <w:bCs/>
-        </w:rPr>
-        <w:t xml:space="preserve">Organización: </w:t>
-      </w:r>
-      <w:r>
-        <w:rPr>
-          <w:b/>
-          <w:bCs/>
-        </w:rPr>
-        <w:t>{</w:t>
-      </w:r>
-      <w:proofErr w:type="spellStart"/>
-      <w:r>
-        <w:rPr>
-          <w:b/>
-          <w:bCs/>
-        </w:rPr>
-        <w:t>organizacion</w:t>
-      </w:r>
-      <w:proofErr w:type="spellEnd"/>
-      <w:r>
-        <w:rPr>
-          <w:b/>
-          <w:bCs/>
-        </w:rPr>
-        <w:t>}</w:t>
-      </w:r>
-    </w:p>
-    <w:p>
-      <w:pPr>
-        <w:spacing w:after="0"/>
-        <w:jc w:val="both"/>
-      </w:pPr>
-      <w:r>
-        <w:t>{</w:t>
-      </w:r>
-      <w:r>
-        <w:t>periodo</w:t>
-      </w:r>
-      <w:r>
-        <w:t>}</w:t>
-      </w:r>
-    </w:p>
-    <w:p>
-      <w:pPr>
-        <w:spacing w:after="0"/>
-        <w:jc w:val="both"/>
-      </w:pPr>
-      <w:r>
-        <w:t xml:space="preserve">Descripción: </w:t>
-      </w:r>
-      <w:r>
-        <w:t>{</w:t>
-      </w:r>
-      <w:proofErr w:type="spellStart"/>
-      <w:r>
-        <w:t>descripcion</w:t>
-      </w:r>
-      <w:proofErr w:type="spellEnd"/>
-      <w:r>
-        <w:t>}</w:t>
-      </w:r>
-    </w:p>
-    <w:p>
-      <w:pPr>
-        <w:spacing w:after="0"/>
-        <w:jc w:val="both"/>
-      </w:pPr>
-      <w:r>
-        <w:t>Entidad: {entidad}</w:t>
-      </w:r>
-    </w:p>
-    <w:p>
-      <w:pPr>
-        <w:jc w:val="both"/>
-      </w:pPr>
-      <w:r>
-        <w:t>Tiempo de estudios: {</w:t>
-      </w:r>
-      <w:proofErr w:type="spellStart"/>
-      <w:r>
-        <w:t>tiempoEstudio</w:t>
-      </w:r>
-      <w:proofErr w:type="spellEnd"/>
-      <w:r>
-        <w:t>}</w:t>
-      </w:r>
-    </w:p>
-    <w:p>
-      <w:pPr>
-        <w:spacing w:after="0"/>
-        <w:jc w:val="both"/>
-      </w:pPr>
-      <w:r>
-        <w:t>{/cursos}</w:t>
-      </w:r>
-    </w:p>
-    <w:p>
-      <w:pPr>
-        <w:spacing w:after="0"/>
-        <w:jc w:val="both"/>
-      </w:pPr>
-      <w:r>
-        <w:t>{/</w:t>
-      </w:r>
-      <w:proofErr w:type="spellStart"/>
-      <w:r>
-        <w:t>tieneCursos</w:t>
-      </w:r>
-      <w:proofErr w:type="spellEnd"/>
-      <w:r>
-        <w:t>}</w:t>
-      </w:r>
-    </w:p>
-    <w:p>
-      <w:pPr>
-        <w:jc w:val="both"/>
-        <w:rPr>
-          <w:lang w:val="es-ES"/>
-        </w:rPr>
-      </w:pPr>
-      <w:r>
-        <w:rPr>
-          <w:lang w:val="es-ES"/>
-        </w:rPr>
-        <w:t>{#tieneComentarios}</w:t>
-      </w:r>
-    </w:p>
-    <w:p>
-      <w:pPr>
-        <w:spacing w:after="0"/>
-        <w:rPr>
-          <w:b/>
-          <w:bCs/>
-          <w:color w:val="0070C0"/>
-          <w:lang w:val="es-ES"/>
-        </w:rPr>
-      </w:pPr>
-      <w:r>
-        <w:rPr>
-          <w:b/>
-          <w:bCs/>
-          <w:color w:val="0070C0"/>
-          <w:lang w:val="es-ES"/>
-        </w:rPr>
-        <w:t>NOTAS O COMENTARIOS</w:t>
-      </w:r>
-    </w:p>
-    <w:p>
-      <w:pPr>
-        <w:spacing w:after="0"/>
+          <w:lang w:val="es-ES"/>
+        </w:rPr>
+      </w:pPr>
+      <w:r>
         <w:rPr>
           <w:b/>
           <w:bCs/>
           <w:color w:val="000000" w:themeColor="text1"/>
-          <w:lang w:val="es-ES"/>
-        </w:rPr>
-      </w:pPr>
+        </w:rPr>
+        <w:t>‾‾‾‾‾‾‾‾‾‾‾‾‾‾‾‾‾‾‾‾‾‾‾‾‾‾‾‾‾‾‾‾‾‾‾‾‾‾‾‾‾‾‾‾‾‾‾‾‾‾‾‾‾‾‾‾‾‾‾‾‾‾‾‾‾‾‾‾‾‾‾‾‾‾‾‾‾‾‾‾‾‾‾‾‾‾‾‾‾‾‾‾‾‾‾‾‾</w:t>
+      </w:r>
       <w:r>
         <w:rPr>
           <w:b/>
           <w:bCs/>
           <w:color w:val="000000" w:themeColor="text1"/>
         </w:rPr>
-        <w:t>‾‾‾‾‾‾‾‾‾‾‾‾‾‾‾‾‾‾‾‾‾‾‾‾‾‾‾‾‾‾‾‾‾‾‾‾‾‾‾‾‾‾‾‾‾‾‾‾‾‾‾‾‾‾‾‾‾‾‾‾‾‾‾‾‾‾‾‾‾‾‾‾‾‾‾‾‾‾‾‾‾‾‾‾‾‾‾‾‾‾‾‾‾‾‾‾‾</w:t>
-      </w:r>
-    </w:p>
-    <w:p>
-      <w:r>
-        <w:t>{comentarios}</w:t>
-      </w:r>
-    </w:p>
-    <w:p>
-      <w:pPr>
+        <w:t>‾‾‾‾‾‾‾‾‾‾‾‾‾‾‾‾‾‾‾‾‾‾‾‾‾‾‾‾‾‾‾‾</w:t>
+      </w:r>
+    </w:p>
+    <w:p>
+      <w:pPr>
+        <w:spacing w:after="0"/>
         <w:jc w:val="both"/>
-      </w:pPr>
-      <w:r>
-        <w:t>{/</w:t>
-      </w:r>
-      <w:proofErr w:type="spellStart"/>
-      <w:r>
-        <w:t>tieneComentarios</w:t>
-      </w:r>
-      <w:proofErr w:type="spellEnd"/>
-      <w:r>
+        <w:rPr>
+          <w:rFonts w:ascii="Palatino Linotype" w:hAnsi="Palatino Linotype" w:cs="Calibri"/>
+          <w:sz w:val="22"/>
+          <w:szCs w:val="22"/>
+          <w:lang w:val="es-ES"/>
+        </w:rPr>
+      </w:pPr>
+      <w:r>
+        <w:rPr>
+          <w:rFonts w:ascii="Palatino Linotype" w:hAnsi="Palatino Linotype" w:cs="Calibri"/>
+          <w:sz w:val="22"/>
+          <w:szCs w:val="22"/>
+          <w:lang w:val="es-ES"/>
+        </w:rPr>
+        <w:t>{#cursos}</w:t>
+      </w:r>
+    </w:p>
+    <w:p>
+      <w:pPr>
+        <w:spacing w:after="0"/>
+        <w:jc w:val="both"/>
+        <w:rPr>
+          <w:rFonts w:ascii="Palatino Linotype" w:hAnsi="Palatino Linotype" w:cs="Calibri"/>
+          <w:b/>
+          <w:sz w:val="22"/>
+          <w:szCs w:val="22"/>
+          <w:lang w:val="es-ES"/>
+        </w:rPr>
+      </w:pPr>
+      <w:r>
+        <w:rPr>
+          <w:rFonts w:ascii="Palatino Linotype" w:hAnsi="Palatino Linotype" w:cs="Calibri"/>
+          <w:b/>
+          <w:sz w:val="22"/>
+          <w:szCs w:val="22"/>
+          <w:lang w:val="es-ES"/>
+        </w:rPr>
+        <w:t xml:space="preserve">• </w:t>
+      </w:r>
+      <w:r>
+        <w:rPr>
+          <w:rFonts w:ascii="Palatino Linotype" w:hAnsi="Palatino Linotype" w:cs="Calibri"/>
+          <w:b/>
+          <w:sz w:val="22"/>
+          <w:szCs w:val="22"/>
+          <w:lang w:val="es-ES"/>
+        </w:rPr>
+        <w:t>{nombre}</w:t>
+      </w:r>
+      <w:r>
+        <w:rPr>
+          <w:rFonts w:ascii="Palatino Linotype" w:hAnsi="Palatino Linotype" w:cs="Calibri"/>
+          <w:b/>
+          <w:sz w:val="22"/>
+          <w:szCs w:val="22"/>
+          <w:lang w:val="es-ES"/>
+        </w:rPr>
+        <w:t xml:space="preserve"> (</w:t>
+      </w:r>
+      <w:r>
+        <w:rPr>
+          <w:rFonts w:ascii="Palatino Linotype" w:hAnsi="Palatino Linotype" w:cs="Calibri"/>
+          <w:b/>
+          <w:sz w:val="22"/>
+          <w:szCs w:val="22"/>
+          <w:lang w:val="es-ES"/>
+        </w:rPr>
+        <w:t>{organizacion}</w:t>
+      </w:r>
+      <w:r>
+        <w:rPr>
+          <w:rFonts w:ascii="Palatino Linotype" w:hAnsi="Palatino Linotype" w:cs="Calibri"/>
+          <w:b/>
+          <w:sz w:val="22"/>
+          <w:szCs w:val="22"/>
+          <w:lang w:val="es-ES"/>
+        </w:rPr>
+        <w:t>,</w:t>
+      </w:r>
+      <w:r>
+        <w:rPr>
+          <w:rFonts w:ascii="Palatino Linotype" w:hAnsi="Palatino Linotype" w:cs="Calibri"/>
+          <w:b/>
+          <w:sz w:val="22"/>
+          <w:szCs w:val="22"/>
+          <w:lang w:val="es-ES"/>
+        </w:rPr>
+        <w:t xml:space="preserve"> </w:t>
+      </w:r>
+      <w:r>
+        <w:rPr>
+          <w:rFonts w:ascii="Palatino Linotype" w:hAnsi="Palatino Linotype" w:cs="Calibri"/>
+          <w:b/>
+          <w:sz w:val="22"/>
+          <w:szCs w:val="22"/>
+          <w:lang w:val="es-ES"/>
+        </w:rPr>
+        <w:t>{</w:t>
+      </w:r>
+      <w:r>
+        <w:rPr>
+          <w:rFonts w:ascii="Palatino Linotype" w:hAnsi="Palatino Linotype" w:cs="Calibri"/>
+          <w:b/>
+          <w:sz w:val="22"/>
+          <w:szCs w:val="22"/>
+          <w:lang w:val="es-ES"/>
+        </w:rPr>
+        <w:t>periodo</w:t>
+      </w:r>
+      <w:r>
+        <w:rPr>
+          <w:rFonts w:ascii="Palatino Linotype" w:hAnsi="Palatino Linotype" w:cs="Calibri"/>
+          <w:b/>
+          <w:sz w:val="22"/>
+          <w:szCs w:val="22"/>
+          <w:lang w:val="es-ES"/>
+        </w:rPr>
         <w:t>}</w:t>
       </w:r>
+      <w:r>
+        <w:rPr>
+          <w:rFonts w:ascii="Palatino Linotype" w:hAnsi="Palatino Linotype" w:cs="Calibri"/>
+          <w:b/>
+          <w:sz w:val="22"/>
+          <w:szCs w:val="22"/>
+          <w:lang w:val="es-ES"/>
+        </w:rPr>
+        <w:t>)</w:t>
+      </w:r>
+    </w:p>
+    <w:p>
+      <w:pPr>
+        <w:spacing w:after="0"/>
+        <w:jc w:val="both"/>
+        <w:rPr>
+          <w:rFonts w:ascii="Palatino Linotype" w:hAnsi="Palatino Linotype" w:cs="Calibri"/>
+          <w:sz w:val="22"/>
+          <w:szCs w:val="22"/>
+          <w:lang w:val="es-ES"/>
+        </w:rPr>
+      </w:pPr>
+      <w:r>
+        <w:rPr>
+          <w:rFonts w:ascii="Palatino Linotype" w:hAnsi="Palatino Linotype" w:cs="Calibri"/>
+          <w:sz w:val="22"/>
+          <w:szCs w:val="22"/>
+          <w:lang w:val="es-ES"/>
+        </w:rPr>
+        <w:t xml:space="preserve">Descripción: </w:t>
+      </w:r>
+      <w:r>
+        <w:rPr>
+          <w:rFonts w:ascii="Palatino Linotype" w:hAnsi="Palatino Linotype" w:cs="Calibri"/>
+          <w:sz w:val="22"/>
+          <w:szCs w:val="22"/>
+          <w:lang w:val="es-ES"/>
+        </w:rPr>
+        <w:t>{descripcion}</w:t>
+      </w:r>
+    </w:p>
+    <w:p>
+      <w:pPr>
+        <w:spacing w:after="0"/>
+        <w:jc w:val="both"/>
+        <w:rPr>
+          <w:rFonts w:ascii="Palatino Linotype" w:hAnsi="Palatino Linotype" w:cs="Calibri"/>
+          <w:sz w:val="22"/>
+          <w:szCs w:val="22"/>
+          <w:lang w:val="es-ES"/>
+        </w:rPr>
+      </w:pPr>
+      <w:r>
+        <w:rPr>
+          <w:rFonts w:ascii="Palatino Linotype" w:hAnsi="Palatino Linotype" w:cs="Calibri"/>
+          <w:sz w:val="22"/>
+          <w:szCs w:val="22"/>
+          <w:lang w:val="es-ES"/>
+        </w:rPr>
+        <w:t>Entidad: {entidad}</w:t>
+      </w:r>
+    </w:p>
+    <w:p>
+      <w:pPr>
+        <w:jc w:val="both"/>
+        <w:rPr>
+          <w:rFonts w:ascii="Palatino Linotype" w:hAnsi="Palatino Linotype" w:cs="Calibri"/>
+          <w:sz w:val="22"/>
+          <w:szCs w:val="22"/>
+          <w:lang w:val="es-ES"/>
+        </w:rPr>
+      </w:pPr>
+      <w:r>
+        <w:rPr>
+          <w:rFonts w:ascii="Palatino Linotype" w:hAnsi="Palatino Linotype" w:cs="Calibri"/>
+          <w:sz w:val="22"/>
+          <w:szCs w:val="22"/>
+          <w:lang w:val="es-ES"/>
+        </w:rPr>
+        <w:t>Tiempo de estudios: {</w:t>
+      </w:r>
+      <w:r>
+        <w:rPr>
+          <w:rFonts w:ascii="Palatino Linotype" w:hAnsi="Palatino Linotype" w:cs="Calibri"/>
+          <w:sz w:val="22"/>
+          <w:szCs w:val="22"/>
+          <w:lang w:val="es-ES"/>
+        </w:rPr>
+        <w:t>tiempoEstudio</w:t>
+      </w:r>
+      <w:r>
+        <w:rPr>
+          <w:rFonts w:ascii="Palatino Linotype" w:hAnsi="Palatino Linotype" w:cs="Calibri"/>
+          <w:sz w:val="22"/>
+          <w:szCs w:val="22"/>
+          <w:lang w:val="es-ES"/>
+        </w:rPr>
+        <w:t>}</w:t>
+      </w:r>
+    </w:p>
+    <w:p>
+      <w:pPr>
+        <w:spacing w:after="0"/>
+        <w:jc w:val="both"/>
+        <w:rPr>
+          <w:rFonts w:ascii="Palatino Linotype" w:hAnsi="Palatino Linotype" w:cs="Calibri"/>
+          <w:sz w:val="22"/>
+          <w:szCs w:val="22"/>
+          <w:lang w:val="es-ES"/>
+        </w:rPr>
+      </w:pPr>
+      <w:r>
+        <w:rPr>
+          <w:rFonts w:ascii="Palatino Linotype" w:hAnsi="Palatino Linotype" w:cs="Calibri"/>
+          <w:sz w:val="22"/>
+          <w:szCs w:val="22"/>
+          <w:lang w:val="es-ES"/>
+        </w:rPr>
+        <w:t>{/cursos}</w:t>
+      </w:r>
+    </w:p>
+    <w:p>
+      <w:pPr>
+        <w:spacing w:after="0"/>
+        <w:jc w:val="both"/>
+        <w:rPr>
+          <w:rFonts w:ascii="Palatino Linotype" w:hAnsi="Palatino Linotype" w:cs="Calibri"/>
+          <w:sz w:val="22"/>
+          <w:szCs w:val="22"/>
+          <w:lang w:val="es-ES"/>
+        </w:rPr>
+      </w:pPr>
+      <w:r>
+        <w:rPr>
+          <w:rFonts w:ascii="Palatino Linotype" w:hAnsi="Palatino Linotype" w:cs="Calibri"/>
+          <w:sz w:val="22"/>
+          <w:szCs w:val="22"/>
+          <w:lang w:val="es-ES"/>
+        </w:rPr>
+        <w:t>{/tieneCursos}</w:t>
+      </w:r>
+    </w:p>
+    <w:p>
+      <w:pPr>
+        <w:jc w:val="both"/>
+      </w:pPr>
     </w:p>
     <w:sectPr>
       <w:pgSz w:w="12240" w:h="15840"/>
@@ -1838,7 +1989,7 @@
 </file>
 
 <file path=word/endnotes.xml><?xml version="1.0" encoding="utf-8"?>
-<w:endnotes xmlns:wpc="http://schemas.microsoft.com/office/word/2010/wordprocessingCanvas" xmlns:cx="http://schemas.microsoft.com/office/drawing/2014/chartex" xmlns:cx1="http://schemas.microsoft.com/office/drawing/2015/9/8/chartex" xmlns:cx2="http://schemas.microsoft.com/office/drawing/2015/10/21/chartex" xmlns:cx3="http://schemas.microsoft.com/office/drawing/2016/5/9/chartex" xmlns:cx4="http://schemas.microsoft.com/office/drawing/2016/5/10/chartex" xmlns:cx5="http://schemas.microsoft.com/office/drawing/2016/5/11/chartex" xmlns:cx6="http://schemas.microsoft.com/office/drawing/2016/5/12/chartex" xmlns:cx7="http://schemas.microsoft.com/office/drawing/2016/5/13/chartex" xmlns:cx8="http://schemas.microsoft.com/office/drawing/2016/5/14/chartex" xmlns:mc="http://schemas.openxmlformats.org/markup-compatibility/2006" xmlns:aink="http://schemas.microsoft.com/office/drawing/2016/ink" xmlns:am3d="http://schemas.microsoft.com/office/drawing/2017/model3d" xmlns:o="urn:schemas-microsoft-com:office:office" xmlns:oel="http://schemas.microsoft.com/office/2019/extlst" xmlns:r="http://schemas.openxmlformats.org/officeDocument/2006/relationships" xmlns:m="http://schemas.openxmlformats.org/officeDocument/2006/math" xmlns:v="urn:schemas-microsoft-com:vml" xmlns:wp14="http://schemas.microsoft.com/office/word/2010/wordprocessingDrawing" xmlns:wp="http://schemas.openxmlformats.org/drawingml/2006/wordprocessingDrawing" xmlns:w10="urn:schemas-microsoft-com:office:word" xmlns:w="http://schemas.openxmlformats.org/wordprocessingml/2006/main" xmlns:w14="http://schemas.microsoft.com/office/word/2010/wordml" xmlns:w15="http://schemas.microsoft.com/office/word/2012/wordml" xmlns:w16cex="http://schemas.microsoft.com/office/word/2018/wordml/cex" xmlns:w16cid="http://schemas.microsoft.com/office/word/2016/wordml/cid" xmlns:w16="http://schemas.microsoft.com/office/word/2018/wordml" xmlns:w16sdtdh="http://schemas.microsoft.com/office/word/2020/wordml/sdtdatahash" xmlns:w16se="http://schemas.microsoft.com/office/word/2015/wordml/symex" xmlns:wpg="http://schemas.microsoft.com/office/word/2010/wordprocessingGroup" xmlns:wpi="http://schemas.microsoft.com/office/word/2010/wordprocessingInk" xmlns:wne="http://schemas.microsoft.com/office/word/2006/wordml" xmlns:wps="http://schemas.microsoft.com/office/word/2010/wordprocessingShape" mc:Ignorable="w14 w15 w16se w16cid w16 w16cex w16sdtdh wp14">
+<w:endnotes xmlns:wpc="http://schemas.microsoft.com/office/word/2010/wordprocessingCanvas" xmlns:cx="http://schemas.microsoft.com/office/drawing/2014/chartex" xmlns:cx1="http://schemas.microsoft.com/office/drawing/2015/9/8/chartex" xmlns:mc="http://schemas.openxmlformats.org/markup-compatibility/2006" xmlns:o="urn:schemas-microsoft-com:office:office" xmlns:r="http://schemas.openxmlformats.org/officeDocument/2006/relationships" xmlns:m="http://schemas.openxmlformats.org/officeDocument/2006/math" xmlns:v="urn:schemas-microsoft-com:vml" xmlns:wp14="http://schemas.microsoft.com/office/word/2010/wordprocessingDrawing" xmlns:wp="http://schemas.openxmlformats.org/drawingml/2006/wordprocessingDrawing" xmlns:w10="urn:schemas-microsoft-com:office:word" xmlns:w="http://schemas.openxmlformats.org/wordprocessingml/2006/main" xmlns:w14="http://schemas.microsoft.com/office/word/2010/wordml" xmlns:w15="http://schemas.microsoft.com/office/word/2012/wordml" xmlns:w16se="http://schemas.microsoft.com/office/word/2015/wordml/symex" xmlns:wpg="http://schemas.microsoft.com/office/word/2010/wordprocessingGroup" xmlns:wpi="http://schemas.microsoft.com/office/word/2010/wordprocessingInk" xmlns:wne="http://schemas.microsoft.com/office/word/2006/wordml" xmlns:wps="http://schemas.microsoft.com/office/word/2010/wordprocessingShape" mc:Ignorable="w14 w15 w16se wp14">
   <w:endnote w:type="separator" w:id="-1">
     <w:p>
       <w:pPr>
@@ -1863,7 +2014,7 @@
 </file>
 
 <file path=word/footnotes.xml><?xml version="1.0" encoding="utf-8"?>
-<w:footnotes xmlns:wpc="http://schemas.microsoft.com/office/word/2010/wordprocessingCanvas" xmlns:cx="http://schemas.microsoft.com/office/drawing/2014/chartex" xmlns:cx1="http://schemas.microsoft.com/office/drawing/2015/9/8/chartex" xmlns:cx2="http://schemas.microsoft.com/office/drawing/2015/10/21/chartex" xmlns:cx3="http://schemas.microsoft.com/office/drawing/2016/5/9/chartex" xmlns:cx4="http://schemas.microsoft.com/office/drawing/2016/5/10/chartex" xmlns:cx5="http://schemas.microsoft.com/office/drawing/2016/5/11/chartex" xmlns:cx6="http://schemas.microsoft.com/office/drawing/2016/5/12/chartex" xmlns:cx7="http://schemas.microsoft.com/office/drawing/2016/5/13/chartex" xmlns:cx8="http://schemas.microsoft.com/office/drawing/2016/5/14/chartex" xmlns:mc="http://schemas.openxmlformats.org/markup-compatibility/2006" xmlns:aink="http://schemas.microsoft.com/office/drawing/2016/ink" xmlns:am3d="http://schemas.microsoft.com/office/drawing/2017/model3d" xmlns:o="urn:schemas-microsoft-com:office:office" xmlns:oel="http://schemas.microsoft.com/office/2019/extlst" xmlns:r="http://schemas.openxmlformats.org/officeDocument/2006/relationships" xmlns:m="http://schemas.openxmlformats.org/officeDocument/2006/math" xmlns:v="urn:schemas-microsoft-com:vml" xmlns:wp14="http://schemas.microsoft.com/office/word/2010/wordprocessingDrawing" xmlns:wp="http://schemas.openxmlformats.org/drawingml/2006/wordprocessingDrawing" xmlns:w10="urn:schemas-microsoft-com:office:word" xmlns:w="http://schemas.openxmlformats.org/wordprocessingml/2006/main" xmlns:w14="http://schemas.microsoft.com/office/word/2010/wordml" xmlns:w15="http://schemas.microsoft.com/office/word/2012/wordml" xmlns:w16cex="http://schemas.microsoft.com/office/word/2018/wordml/cex" xmlns:w16cid="http://schemas.microsoft.com/office/word/2016/wordml/cid" xmlns:w16="http://schemas.microsoft.com/office/word/2018/wordml" xmlns:w16sdtdh="http://schemas.microsoft.com/office/word/2020/wordml/sdtdatahash" xmlns:w16se="http://schemas.microsoft.com/office/word/2015/wordml/symex" xmlns:wpg="http://schemas.microsoft.com/office/word/2010/wordprocessingGroup" xmlns:wpi="http://schemas.microsoft.com/office/word/2010/wordprocessingInk" xmlns:wne="http://schemas.microsoft.com/office/word/2006/wordml" xmlns:wps="http://schemas.microsoft.com/office/word/2010/wordprocessingShape" mc:Ignorable="w14 w15 w16se w16cid w16 w16cex w16sdtdh wp14">
+<w:footnotes xmlns:wpc="http://schemas.microsoft.com/office/word/2010/wordprocessingCanvas" xmlns:cx="http://schemas.microsoft.com/office/drawing/2014/chartex" xmlns:cx1="http://schemas.microsoft.com/office/drawing/2015/9/8/chartex" xmlns:mc="http://schemas.openxmlformats.org/markup-compatibility/2006" xmlns:o="urn:schemas-microsoft-com:office:office" xmlns:r="http://schemas.openxmlformats.org/officeDocument/2006/relationships" xmlns:m="http://schemas.openxmlformats.org/officeDocument/2006/math" xmlns:v="urn:schemas-microsoft-com:vml" xmlns:wp14="http://schemas.microsoft.com/office/word/2010/wordprocessingDrawing" xmlns:wp="http://schemas.openxmlformats.org/drawingml/2006/wordprocessingDrawing" xmlns:w10="urn:schemas-microsoft-com:office:word" xmlns:w="http://schemas.openxmlformats.org/wordprocessingml/2006/main" xmlns:w14="http://schemas.microsoft.com/office/word/2010/wordml" xmlns:w15="http://schemas.microsoft.com/office/word/2012/wordml" xmlns:w16se="http://schemas.microsoft.com/office/word/2015/wordml/symex" xmlns:wpg="http://schemas.microsoft.com/office/word/2010/wordprocessingGroup" xmlns:wpi="http://schemas.microsoft.com/office/word/2010/wordprocessingInk" xmlns:wne="http://schemas.microsoft.com/office/word/2006/wordml" xmlns:wps="http://schemas.microsoft.com/office/word/2010/wordprocessingShape" mc:Ignorable="w14 w15 w16se wp14">
   <w:footnote w:type="separator" w:id="-1">
     <w:p>
       <w:pPr>
@@ -1888,7 +2039,7 @@
 </file>
 
 <file path=word/numbering.xml><?xml version="1.0" encoding="utf-8"?>
-<w:numbering xmlns:wpc="http://schemas.microsoft.com/office/word/2010/wordprocessingCanvas" xmlns:cx="http://schemas.microsoft.com/office/drawing/2014/chartex" xmlns:cx1="http://schemas.microsoft.com/office/drawing/2015/9/8/chartex" xmlns:cx2="http://schemas.microsoft.com/office/drawing/2015/10/21/chartex" xmlns:cx3="http://schemas.microsoft.com/office/drawing/2016/5/9/chartex" xmlns:cx4="http://schemas.microsoft.com/office/drawing/2016/5/10/chartex" xmlns:cx5="http://schemas.microsoft.com/office/drawing/2016/5/11/chartex" xmlns:cx6="http://schemas.microsoft.com/office/drawing/2016/5/12/chartex" xmlns:cx7="http://schemas.microsoft.com/office/drawing/2016/5/13/chartex" xmlns:cx8="http://schemas.microsoft.com/office/drawing/2016/5/14/chartex" xmlns:mc="http://schemas.openxmlformats.org/markup-compatibility/2006" xmlns:aink="http://schemas.microsoft.com/office/drawing/2016/ink" xmlns:am3d="http://schemas.microsoft.com/office/drawing/2017/model3d" xmlns:o="urn:schemas-microsoft-com:office:office" xmlns:oel="http://schemas.microsoft.com/office/2019/extlst" xmlns:r="http://schemas.openxmlformats.org/officeDocument/2006/relationships" xmlns:m="http://schemas.openxmlformats.org/officeDocument/2006/math" xmlns:v="urn:schemas-microsoft-com:vml" xmlns:wp14="http://schemas.microsoft.com/office/word/2010/wordprocessingDrawing" xmlns:wp="http://schemas.openxmlformats.org/drawingml/2006/wordprocessingDrawing" xmlns:w10="urn:schemas-microsoft-com:office:word" xmlns:w="http://schemas.openxmlformats.org/wordprocessingml/2006/main" xmlns:w14="http://schemas.microsoft.com/office/word/2010/wordml" xmlns:w15="http://schemas.microsoft.com/office/word/2012/wordml" xmlns:w16cex="http://schemas.microsoft.com/office/word/2018/wordml/cex" xmlns:w16cid="http://schemas.microsoft.com/office/word/2016/wordml/cid" xmlns:w16="http://schemas.microsoft.com/office/word/2018/wordml" xmlns:w16sdtdh="http://schemas.microsoft.com/office/word/2020/wordml/sdtdatahash" xmlns:w16se="http://schemas.microsoft.com/office/word/2015/wordml/symex" xmlns:wpg="http://schemas.microsoft.com/office/word/2010/wordprocessingGroup" xmlns:wpi="http://schemas.microsoft.com/office/word/2010/wordprocessingInk" xmlns:wne="http://schemas.microsoft.com/office/word/2006/wordml" xmlns:wps="http://schemas.microsoft.com/office/word/2010/wordprocessingShape" mc:Ignorable="w14 w15 w16se w16cid w16 w16cex w16sdtdh wp14">
+<w:numbering xmlns:wpc="http://schemas.microsoft.com/office/word/2010/wordprocessingCanvas" xmlns:cx="http://schemas.microsoft.com/office/drawing/2014/chartex" xmlns:cx1="http://schemas.microsoft.com/office/drawing/2015/9/8/chartex" xmlns:mc="http://schemas.openxmlformats.org/markup-compatibility/2006" xmlns:o="urn:schemas-microsoft-com:office:office" xmlns:r="http://schemas.openxmlformats.org/officeDocument/2006/relationships" xmlns:m="http://schemas.openxmlformats.org/officeDocument/2006/math" xmlns:v="urn:schemas-microsoft-com:vml" xmlns:wp14="http://schemas.microsoft.com/office/word/2010/wordprocessingDrawing" xmlns:wp="http://schemas.openxmlformats.org/drawingml/2006/wordprocessingDrawing" xmlns:w10="urn:schemas-microsoft-com:office:word" xmlns:w="http://schemas.openxmlformats.org/wordprocessingml/2006/main" xmlns:w14="http://schemas.microsoft.com/office/word/2010/wordml" xmlns:w15="http://schemas.microsoft.com/office/word/2012/wordml" xmlns:w16se="http://schemas.microsoft.com/office/word/2015/wordml/symex" xmlns:wpg="http://schemas.microsoft.com/office/word/2010/wordprocessingGroup" xmlns:wpi="http://schemas.microsoft.com/office/word/2010/wordprocessingInk" xmlns:wne="http://schemas.microsoft.com/office/word/2006/wordml" xmlns:wps="http://schemas.microsoft.com/office/word/2010/wordprocessingShape" mc:Ignorable="w14 w15 w16se wp14">
   <w:abstractNum w:abstractNumId="0" w15:restartNumberingAfterBreak="0">
     <w:nsid w:val="0F8E7743"/>
     <w:multiLevelType w:val="hybridMultilevel"/>
@@ -2341,23 +2492,138 @@
       </w:rPr>
     </w:lvl>
   </w:abstractNum>
-  <w:num w:numId="1" w16cid:durableId="1412658482">
+  <w:abstractNum w:abstractNumId="4" w15:restartNumberingAfterBreak="0">
+    <w:nsid w:val="732366CD"/>
+    <w:multiLevelType w:val="hybridMultilevel"/>
+    <w:tmpl w:val="DC229600"/>
+    <w:lvl w:ilvl="0" w:tplc="8CC83D52">
+      <w:numFmt w:val="bullet"/>
+      <w:lvlText w:val=""/>
+      <w:lvlJc w:val="left"/>
+      <w:pPr>
+        <w:ind w:left="720" w:hanging="360"/>
+      </w:pPr>
+      <w:rPr>
+        <w:rFonts w:ascii="Symbol" w:eastAsiaTheme="minorHAnsi" w:hAnsi="Symbol" w:cs="Calibri" w:hint="default"/>
+      </w:rPr>
+    </w:lvl>
+    <w:lvl w:ilvl="1" w:tplc="080A0003" w:tentative="1">
+      <w:start w:val="1"/>
+      <w:numFmt w:val="bullet"/>
+      <w:lvlText w:val="o"/>
+      <w:lvlJc w:val="left"/>
+      <w:pPr>
+        <w:ind w:left="1440" w:hanging="360"/>
+      </w:pPr>
+      <w:rPr>
+        <w:rFonts w:ascii="Courier New" w:hAnsi="Courier New" w:cs="Courier New" w:hint="default"/>
+      </w:rPr>
+    </w:lvl>
+    <w:lvl w:ilvl="2" w:tplc="080A0005" w:tentative="1">
+      <w:start w:val="1"/>
+      <w:numFmt w:val="bullet"/>
+      <w:lvlText w:val=""/>
+      <w:lvlJc w:val="left"/>
+      <w:pPr>
+        <w:ind w:left="2160" w:hanging="360"/>
+      </w:pPr>
+      <w:rPr>
+        <w:rFonts w:ascii="Wingdings" w:hAnsi="Wingdings" w:hint="default"/>
+      </w:rPr>
+    </w:lvl>
+    <w:lvl w:ilvl="3" w:tplc="080A0001" w:tentative="1">
+      <w:start w:val="1"/>
+      <w:numFmt w:val="bullet"/>
+      <w:lvlText w:val=""/>
+      <w:lvlJc w:val="left"/>
+      <w:pPr>
+        <w:ind w:left="2880" w:hanging="360"/>
+      </w:pPr>
+      <w:rPr>
+        <w:rFonts w:ascii="Symbol" w:hAnsi="Symbol" w:hint="default"/>
+      </w:rPr>
+    </w:lvl>
+    <w:lvl w:ilvl="4" w:tplc="080A0003" w:tentative="1">
+      <w:start w:val="1"/>
+      <w:numFmt w:val="bullet"/>
+      <w:lvlText w:val="o"/>
+      <w:lvlJc w:val="left"/>
+      <w:pPr>
+        <w:ind w:left="3600" w:hanging="360"/>
+      </w:pPr>
+      <w:rPr>
+        <w:rFonts w:ascii="Courier New" w:hAnsi="Courier New" w:cs="Courier New" w:hint="default"/>
+      </w:rPr>
+    </w:lvl>
+    <w:lvl w:ilvl="5" w:tplc="080A0005" w:tentative="1">
+      <w:start w:val="1"/>
+      <w:numFmt w:val="bullet"/>
+      <w:lvlText w:val=""/>
+      <w:lvlJc w:val="left"/>
+      <w:pPr>
+        <w:ind w:left="4320" w:hanging="360"/>
+      </w:pPr>
+      <w:rPr>
+        <w:rFonts w:ascii="Wingdings" w:hAnsi="Wingdings" w:hint="default"/>
+      </w:rPr>
+    </w:lvl>
+    <w:lvl w:ilvl="6" w:tplc="080A0001" w:tentative="1">
+      <w:start w:val="1"/>
+      <w:numFmt w:val="bullet"/>
+      <w:lvlText w:val=""/>
+      <w:lvlJc w:val="left"/>
+      <w:pPr>
+        <w:ind w:left="5040" w:hanging="360"/>
+      </w:pPr>
+      <w:rPr>
+        <w:rFonts w:ascii="Symbol" w:hAnsi="Symbol" w:hint="default"/>
+      </w:rPr>
+    </w:lvl>
+    <w:lvl w:ilvl="7" w:tplc="080A0003" w:tentative="1">
+      <w:start w:val="1"/>
+      <w:numFmt w:val="bullet"/>
+      <w:lvlText w:val="o"/>
+      <w:lvlJc w:val="left"/>
+      <w:pPr>
+        <w:ind w:left="5760" w:hanging="360"/>
+      </w:pPr>
+      <w:rPr>
+        <w:rFonts w:ascii="Courier New" w:hAnsi="Courier New" w:cs="Courier New" w:hint="default"/>
+      </w:rPr>
+    </w:lvl>
+    <w:lvl w:ilvl="8" w:tplc="080A0005" w:tentative="1">
+      <w:start w:val="1"/>
+      <w:numFmt w:val="bullet"/>
+      <w:lvlText w:val=""/>
+      <w:lvlJc w:val="left"/>
+      <w:pPr>
+        <w:ind w:left="6480" w:hanging="360"/>
+      </w:pPr>
+      <w:rPr>
+        <w:rFonts w:ascii="Wingdings" w:hAnsi="Wingdings" w:hint="default"/>
+      </w:rPr>
+    </w:lvl>
+  </w:abstractNum>
+  <w:num w:numId="1">
     <w:abstractNumId w:val="1"/>
   </w:num>
-  <w:num w:numId="2" w16cid:durableId="774179265">
+  <w:num w:numId="2">
     <w:abstractNumId w:val="3"/>
   </w:num>
-  <w:num w:numId="3" w16cid:durableId="1310864200">
+  <w:num w:numId="3">
     <w:abstractNumId w:val="0"/>
   </w:num>
-  <w:num w:numId="4" w16cid:durableId="1441146621">
+  <w:num w:numId="4">
     <w:abstractNumId w:val="2"/>
+  </w:num>
+  <w:num w:numId="5">
+    <w:abstractNumId w:val="4"/>
   </w:num>
 </w:numbering>
 </file>
 
 <file path=word/styles.xml><?xml version="1.0" encoding="utf-8"?>
-<w:styles xmlns:mc="http://schemas.openxmlformats.org/markup-compatibility/2006" xmlns:r="http://schemas.openxmlformats.org/officeDocument/2006/relationships" xmlns:w="http://schemas.openxmlformats.org/wordprocessingml/2006/main" xmlns:w14="http://schemas.microsoft.com/office/word/2010/wordml" xmlns:w15="http://schemas.microsoft.com/office/word/2012/wordml" xmlns:w16cex="http://schemas.microsoft.com/office/word/2018/wordml/cex" xmlns:w16cid="http://schemas.microsoft.com/office/word/2016/wordml/cid" xmlns:w16="http://schemas.microsoft.com/office/word/2018/wordml" xmlns:w16sdtdh="http://schemas.microsoft.com/office/word/2020/wordml/sdtdatahash" xmlns:w16se="http://schemas.microsoft.com/office/word/2015/wordml/symex" mc:Ignorable="w14 w15 w16se w16cid w16 w16cex w16sdtdh">
+<w:styles xmlns:mc="http://schemas.openxmlformats.org/markup-compatibility/2006" xmlns:r="http://schemas.openxmlformats.org/officeDocument/2006/relationships" xmlns:w="http://schemas.openxmlformats.org/wordprocessingml/2006/main" xmlns:w14="http://schemas.microsoft.com/office/word/2010/wordml" xmlns:w15="http://schemas.microsoft.com/office/word/2012/wordml" xmlns:w16se="http://schemas.microsoft.com/office/word/2015/wordml/symex" mc:Ignorable="w14 w15 w16se">
   <w:docDefaults>
     <w:rPrDefault>
       <w:rPr>
@@ -2375,7 +2641,7 @@
       </w:pPr>
     </w:pPrDefault>
   </w:docDefaults>
-  <w:latentStyles w:defLockedState="0" w:defUIPriority="99" w:defSemiHidden="0" w:defUnhideWhenUsed="0" w:defQFormat="0" w:count="376">
+  <w:latentStyles w:defLockedState="0" w:defUIPriority="99" w:defSemiHidden="0" w:defUnhideWhenUsed="0" w:defQFormat="0" w:count="371">
     <w:lsdException w:name="Normal" w:uiPriority="0" w:qFormat="1"/>
     <w:lsdException w:name="heading 1" w:uiPriority="9" w:qFormat="1"/>
     <w:lsdException w:name="heading 2" w:semiHidden="1" w:uiPriority="9" w:unhideWhenUsed="1" w:qFormat="1"/>
@@ -2747,11 +3013,6 @@
     <w:lsdException w:name="List Table 5 Dark Accent 6" w:uiPriority="50"/>
     <w:lsdException w:name="List Table 6 Colorful Accent 6" w:uiPriority="51"/>
     <w:lsdException w:name="List Table 7 Colorful Accent 6" w:uiPriority="52"/>
-    <w:lsdException w:name="Mention" w:semiHidden="1" w:unhideWhenUsed="1"/>
-    <w:lsdException w:name="Smart Hyperlink" w:semiHidden="1" w:unhideWhenUsed="1"/>
-    <w:lsdException w:name="Hashtag" w:semiHidden="1" w:unhideWhenUsed="1"/>
-    <w:lsdException w:name="Unresolved Mention" w:semiHidden="1" w:unhideWhenUsed="1"/>
-    <w:lsdException w:name="Smart Link" w:semiHidden="1" w:unhideWhenUsed="1"/>
   </w:latentStyles>
   <w:style w:type="paragraph" w:default="1" w:styleId="Normal">
     <w:name w:val="Normal"/>
@@ -3336,6 +3597,55 @@
       </w:tblBorders>
     </w:tblPr>
   </w:style>
+  <w:style w:type="table" w:styleId="Tablanormal4">
+    <w:name w:val="Plain Table 4"/>
+    <w:basedOn w:val="Tablanormal"/>
+    <w:uiPriority w:val="44"/>
+    <w:rsid w:val="00223168"/>
+    <w:pPr>
+      <w:spacing w:after="0" w:line="240" w:lineRule="auto"/>
+    </w:pPr>
+    <w:tblPr>
+      <w:tblStyleRowBandSize w:val="1"/>
+      <w:tblStyleColBandSize w:val="1"/>
+    </w:tblPr>
+    <w:tblStylePr w:type="firstRow">
+      <w:rPr>
+        <w:b/>
+        <w:bCs/>
+      </w:rPr>
+    </w:tblStylePr>
+    <w:tblStylePr w:type="lastRow">
+      <w:rPr>
+        <w:b/>
+        <w:bCs/>
+      </w:rPr>
+    </w:tblStylePr>
+    <w:tblStylePr w:type="firstCol">
+      <w:rPr>
+        <w:b/>
+        <w:bCs/>
+      </w:rPr>
+    </w:tblStylePr>
+    <w:tblStylePr w:type="lastCol">
+      <w:rPr>
+        <w:b/>
+        <w:bCs/>
+      </w:rPr>
+    </w:tblStylePr>
+    <w:tblStylePr w:type="band1Vert">
+      <w:tblPr/>
+      <w:tcPr>
+        <w:shd w:val="clear" w:color="auto" w:fill="F2F2F2" w:themeFill="background1" w:themeFillShade="F2"/>
+      </w:tcPr>
+    </w:tblStylePr>
+    <w:tblStylePr w:type="band1Horz">
+      <w:tblPr/>
+      <w:tcPr>
+        <w:shd w:val="clear" w:color="auto" w:fill="F2F2F2" w:themeFill="background1" w:themeFillShade="F2"/>
+      </w:tcPr>
+    </w:tblStylePr>
+  </w:style>
 </w:styles>
 </file>
 
@@ -3639,7 +3949,7 @@
 </file>
 
 <file path=customXml/itemProps1.xml><?xml version="1.0" encoding="utf-8"?>
-<ds:datastoreItem xmlns:ds="http://schemas.openxmlformats.org/officeDocument/2006/customXml" ds:itemID="{9EB2C54C-8BA0-420D-A989-6CB994B3DFC2}">
+<ds:datastoreItem xmlns:ds="http://schemas.openxmlformats.org/officeDocument/2006/customXml" ds:itemID="{DBAF7CD7-DF81-4609-B3FA-59D7D36CDEA7}">
   <ds:schemaRefs>
     <ds:schemaRef ds:uri="http://schemas.openxmlformats.org/officeDocument/2006/bibliography"/>
   </ds:schemaRefs>

</xml_diff>